<commit_message>
docs: align Word document 1:1 with PDF reference including embedded high-res diagrams and clean table styling
</commit_message>
<xml_diff>
--- a/Rancangan_Arsitektur_dan_Alur_Helpdesk_Ticketing.docx
+++ b/Rancangan_Arsitektur_dan_Alur_Helpdesk_Ticketing.docx
@@ -4,40 +4,39 @@
   <w:body>
     <w:p>
       <w:pPr>
-        <w:spacing w:after="40"/>
+        <w:spacing w:before="0" w:after="40"/>
         <w:jc w:val="center"/>
       </w:pPr>
       <w:r>
         <w:rPr>
-          <w:rFonts w:ascii="Times New Roman" w:hAnsi="Times New Roman"/>
           <w:b/>
-          <w:sz w:val="28"/>
+          <w:sz w:val="27"/>
         </w:rPr>
         <w:t>RANCANGAN ARSITEKTUR, MATRIKS AKSES, DAN ALUR SISTEM HELPDESK TICKETING</w:t>
       </w:r>
     </w:p>
     <w:p>
       <w:pPr>
-        <w:spacing w:after="320"/>
+        <w:spacing w:after="240"/>
         <w:jc w:val="center"/>
       </w:pPr>
       <w:r>
         <w:rPr>
           <w:i/>
           <w:color w:val="475569"/>
-          <w:sz w:val="20"/>
+          <w:sz w:val="19"/>
         </w:rPr>
-        <w:t>Spesifikasi Desain Sistem: Arsitektur Full-Stack (Vue.js, Express.js, MySQL, SMTP Relay), RBAC Matrix, Flowchart Alur Penanganan Insiden, dan Formula Dual-SLA Engine</w:t>
+        <w:t>Dokumen Spesifikasi Teknis: Desain Arsitektur Full-Stack (Vue.js, Express.js, MySQL, SMTP), Matriks Hak Akses (RBAC), Flowchart Penanganan Insiden, dan Logika Evaluasi SLA</w:t>
       </w:r>
     </w:p>
     <w:p>
       <w:pPr>
-        <w:spacing w:before="240" w:after="120"/>
+        <w:spacing w:before="120" w:after="80"/>
       </w:pPr>
       <w:r>
         <w:rPr>
           <w:b/>
-          <w:sz w:val="22"/>
+          <w:sz w:val="21"/>
         </w:rPr>
         <w:t>DAFTAR ISTILAH DAN SINGKATAN</w:t>
       </w:r>
@@ -47,29 +46,37 @@
         <w:tblW w:type="auto" w:w="0"/>
         <w:jc w:val="center"/>
         <w:tblLook w:firstColumn="1" w:firstRow="1" w:lastColumn="0" w:lastRow="0" w:noHBand="0" w:noVBand="1" w:val="04A0"/>
+        <w:tblBorders>
+          <w:top w:val="single" w:sz="4" w:space="0" w:color="CBD5E1"/>
+          <w:bottom w:val="single" w:sz="4" w:space="0" w:color="CBD5E1"/>
+          <w:left w:val="single" w:sz="4" w:space="0" w:color="CBD5E1"/>
+          <w:right w:val="single" w:sz="4" w:space="0" w:color="CBD5E1"/>
+          <w:insideH w:val="single" w:sz="4" w:space="0" w:color="CBD5E1"/>
+          <w:insideV w:val="single" w:sz="4" w:space="0" w:color="CBD5E1"/>
+        </w:tblBorders>
       </w:tblPr>
       <w:tblGrid>
-        <w:gridCol w:w="3010"/>
-        <w:gridCol w:w="3010"/>
-        <w:gridCol w:w="3010"/>
+        <w:gridCol w:w="3106"/>
+        <w:gridCol w:w="3106"/>
+        <w:gridCol w:w="3106"/>
       </w:tblGrid>
       <w:tr>
         <w:tc>
           <w:tcPr>
-            <w:tcW w:type="dxa" w:w="3010"/>
+            <w:tcW w:type="dxa" w:w="3106"/>
             <w:shd w:fill="F1F5F9"/>
             <w:tcMar>
-              <w:top w:w="100" w:type="dxa"/>
-              <w:bottom w:w="100" w:type="dxa"/>
-              <w:left w:w="120" w:type="dxa"/>
-              <w:right w:w="120" w:type="dxa"/>
+              <w:top w:w="80" w:type="dxa"/>
+              <w:bottom w:w="80" w:type="dxa"/>
+              <w:left w:w="100" w:type="dxa"/>
+              <w:right w:w="100" w:type="dxa"/>
             </w:tcMar>
           </w:tcPr>
           <w:p>
             <w:r>
               <w:rPr>
                 <w:b/>
-                <w:sz w:val="19"/>
+                <w:sz w:val="18"/>
               </w:rPr>
               <w:t>Singkatan</w:t>
             </w:r>
@@ -77,20 +84,20 @@
         </w:tc>
         <w:tc>
           <w:tcPr>
-            <w:tcW w:type="dxa" w:w="3010"/>
+            <w:tcW w:type="dxa" w:w="3106"/>
             <w:shd w:fill="F1F5F9"/>
             <w:tcMar>
-              <w:top w:w="100" w:type="dxa"/>
-              <w:bottom w:w="100" w:type="dxa"/>
-              <w:left w:w="120" w:type="dxa"/>
-              <w:right w:w="120" w:type="dxa"/>
+              <w:top w:w="80" w:type="dxa"/>
+              <w:bottom w:w="80" w:type="dxa"/>
+              <w:left w:w="100" w:type="dxa"/>
+              <w:right w:w="100" w:type="dxa"/>
             </w:tcMar>
           </w:tcPr>
           <w:p>
             <w:r>
               <w:rPr>
                 <w:b/>
-                <w:sz w:val="19"/>
+                <w:sz w:val="18"/>
               </w:rPr>
               <w:t>Kepanjangan / Istilah Lengkap</w:t>
             </w:r>
@@ -98,20 +105,20 @@
         </w:tc>
         <w:tc>
           <w:tcPr>
-            <w:tcW w:type="dxa" w:w="3010"/>
+            <w:tcW w:type="dxa" w:w="3106"/>
             <w:shd w:fill="F1F5F9"/>
             <w:tcMar>
-              <w:top w:w="100" w:type="dxa"/>
-              <w:bottom w:w="100" w:type="dxa"/>
-              <w:left w:w="120" w:type="dxa"/>
-              <w:right w:w="120" w:type="dxa"/>
+              <w:top w:w="80" w:type="dxa"/>
+              <w:bottom w:w="80" w:type="dxa"/>
+              <w:left w:w="100" w:type="dxa"/>
+              <w:right w:w="100" w:type="dxa"/>
             </w:tcMar>
           </w:tcPr>
           <w:p>
             <w:r>
               <w:rPr>
                 <w:b/>
-                <w:sz w:val="19"/>
+                <w:sz w:val="18"/>
               </w:rPr>
               <w:t>Penjelasan Fungsi dalam Sistem</w:t>
             </w:r>
@@ -121,19 +128,19 @@
       <w:tr>
         <w:tc>
           <w:tcPr>
-            <w:tcW w:type="dxa" w:w="3010"/>
+            <w:tcW w:type="dxa" w:w="3106"/>
             <w:tcMar>
-              <w:top w:w="80" w:type="dxa"/>
-              <w:bottom w:w="80" w:type="dxa"/>
-              <w:left w:w="120" w:type="dxa"/>
-              <w:right w:w="120" w:type="dxa"/>
+              <w:top w:w="60" w:type="dxa"/>
+              <w:bottom w:w="60" w:type="dxa"/>
+              <w:left w:w="100" w:type="dxa"/>
+              <w:right w:w="100" w:type="dxa"/>
             </w:tcMar>
           </w:tcPr>
           <w:p>
             <w:r>
               <w:rPr>
                 <w:b/>
-                <w:sz w:val="19"/>
+                <w:sz w:val="17"/>
               </w:rPr>
               <w:t>CPIG</w:t>
             </w:r>
@@ -141,18 +148,18 @@
         </w:tc>
         <w:tc>
           <w:tcPr>
-            <w:tcW w:type="dxa" w:w="3010"/>
+            <w:tcW w:type="dxa" w:w="3106"/>
             <w:tcMar>
-              <w:top w:w="80" w:type="dxa"/>
-              <w:bottom w:w="80" w:type="dxa"/>
-              <w:left w:w="120" w:type="dxa"/>
-              <w:right w:w="120" w:type="dxa"/>
+              <w:top w:w="60" w:type="dxa"/>
+              <w:bottom w:w="60" w:type="dxa"/>
+              <w:left w:w="100" w:type="dxa"/>
+              <w:right w:w="100" w:type="dxa"/>
             </w:tcMar>
           </w:tcPr>
           <w:p>
             <w:r>
               <w:rPr>
-                <w:sz w:val="19"/>
+                <w:sz w:val="17"/>
               </w:rPr>
               <w:t>Customer Problem Incident Group</w:t>
             </w:r>
@@ -160,18 +167,18 @@
         </w:tc>
         <w:tc>
           <w:tcPr>
-            <w:tcW w:type="dxa" w:w="3010"/>
+            <w:tcW w:type="dxa" w:w="3106"/>
             <w:tcMar>
-              <w:top w:w="80" w:type="dxa"/>
-              <w:bottom w:w="80" w:type="dxa"/>
-              <w:left w:w="120" w:type="dxa"/>
-              <w:right w:w="120" w:type="dxa"/>
+              <w:top w:w="60" w:type="dxa"/>
+              <w:bottom w:w="60" w:type="dxa"/>
+              <w:left w:w="100" w:type="dxa"/>
+              <w:right w:w="100" w:type="dxa"/>
             </w:tcMar>
           </w:tcPr>
           <w:p>
             <w:r>
               <w:rPr>
-                <w:sz w:val="19"/>
+                <w:sz w:val="17"/>
               </w:rPr>
               <w:t>Staf Helpdesk &amp; Dispatcher yang menerima keluhan, menerbitkan tiket, mengalokasikan teknisi, dan berkomunikasi dengan klien.</w:t>
             </w:r>
@@ -181,20 +188,20 @@
       <w:tr>
         <w:tc>
           <w:tcPr>
-            <w:tcW w:type="dxa" w:w="3010"/>
+            <w:tcW w:type="dxa" w:w="3106"/>
             <w:shd w:fill="F8FAFC"/>
             <w:tcMar>
-              <w:top w:w="80" w:type="dxa"/>
-              <w:bottom w:w="80" w:type="dxa"/>
-              <w:left w:w="120" w:type="dxa"/>
-              <w:right w:w="120" w:type="dxa"/>
+              <w:top w:w="60" w:type="dxa"/>
+              <w:bottom w:w="60" w:type="dxa"/>
+              <w:left w:w="100" w:type="dxa"/>
+              <w:right w:w="100" w:type="dxa"/>
             </w:tcMar>
           </w:tcPr>
           <w:p>
             <w:r>
               <w:rPr>
                 <w:b/>
-                <w:sz w:val="19"/>
+                <w:sz w:val="17"/>
               </w:rPr>
               <w:t>SLA</w:t>
             </w:r>
@@ -202,19 +209,19 @@
         </w:tc>
         <w:tc>
           <w:tcPr>
-            <w:tcW w:type="dxa" w:w="3010"/>
+            <w:tcW w:type="dxa" w:w="3106"/>
             <w:shd w:fill="F8FAFC"/>
             <w:tcMar>
-              <w:top w:w="80" w:type="dxa"/>
-              <w:bottom w:w="80" w:type="dxa"/>
-              <w:left w:w="120" w:type="dxa"/>
-              <w:right w:w="120" w:type="dxa"/>
+              <w:top w:w="60" w:type="dxa"/>
+              <w:bottom w:w="60" w:type="dxa"/>
+              <w:left w:w="100" w:type="dxa"/>
+              <w:right w:w="100" w:type="dxa"/>
             </w:tcMar>
           </w:tcPr>
           <w:p>
             <w:r>
               <w:rPr>
-                <w:sz w:val="19"/>
+                <w:sz w:val="17"/>
               </w:rPr>
               <w:t>Service Level Agreement</w:t>
             </w:r>
@@ -222,19 +229,19 @@
         </w:tc>
         <w:tc>
           <w:tcPr>
-            <w:tcW w:type="dxa" w:w="3010"/>
+            <w:tcW w:type="dxa" w:w="3106"/>
             <w:shd w:fill="F8FAFC"/>
             <w:tcMar>
-              <w:top w:w="80" w:type="dxa"/>
-              <w:bottom w:w="80" w:type="dxa"/>
-              <w:left w:w="120" w:type="dxa"/>
-              <w:right w:w="120" w:type="dxa"/>
+              <w:top w:w="60" w:type="dxa"/>
+              <w:bottom w:w="60" w:type="dxa"/>
+              <w:left w:w="100" w:type="dxa"/>
+              <w:right w:w="100" w:type="dxa"/>
             </w:tcMar>
           </w:tcPr>
           <w:p>
             <w:r>
               <w:rPr>
-                <w:sz w:val="19"/>
+                <w:sz w:val="17"/>
               </w:rPr>
               <w:t>Kesepakatan batas waktu layanan penanganan insiden yang mengikat secara kontraktual.</w:t>
             </w:r>
@@ -244,19 +251,19 @@
       <w:tr>
         <w:tc>
           <w:tcPr>
-            <w:tcW w:type="dxa" w:w="3010"/>
+            <w:tcW w:type="dxa" w:w="3106"/>
             <w:tcMar>
-              <w:top w:w="80" w:type="dxa"/>
-              <w:bottom w:w="80" w:type="dxa"/>
-              <w:left w:w="120" w:type="dxa"/>
-              <w:right w:w="120" w:type="dxa"/>
+              <w:top w:w="60" w:type="dxa"/>
+              <w:bottom w:w="60" w:type="dxa"/>
+              <w:left w:w="100" w:type="dxa"/>
+              <w:right w:w="100" w:type="dxa"/>
             </w:tcMar>
           </w:tcPr>
           <w:p>
             <w:r>
               <w:rPr>
                 <w:b/>
-                <w:sz w:val="19"/>
+                <w:sz w:val="17"/>
               </w:rPr>
               <w:t>MTTR</w:t>
             </w:r>
@@ -264,18 +271,18 @@
         </w:tc>
         <w:tc>
           <w:tcPr>
-            <w:tcW w:type="dxa" w:w="3010"/>
+            <w:tcW w:type="dxa" w:w="3106"/>
             <w:tcMar>
-              <w:top w:w="80" w:type="dxa"/>
-              <w:bottom w:w="80" w:type="dxa"/>
-              <w:left w:w="120" w:type="dxa"/>
-              <w:right w:w="120" w:type="dxa"/>
+              <w:top w:w="60" w:type="dxa"/>
+              <w:bottom w:w="60" w:type="dxa"/>
+              <w:left w:w="100" w:type="dxa"/>
+              <w:right w:w="100" w:type="dxa"/>
             </w:tcMar>
           </w:tcPr>
           <w:p>
             <w:r>
               <w:rPr>
-                <w:sz w:val="19"/>
+                <w:sz w:val="17"/>
               </w:rPr>
               <w:t>Mean Time To Resolve</w:t>
             </w:r>
@@ -283,18 +290,18 @@
         </w:tc>
         <w:tc>
           <w:tcPr>
-            <w:tcW w:type="dxa" w:w="3010"/>
+            <w:tcW w:type="dxa" w:w="3106"/>
             <w:tcMar>
-              <w:top w:w="80" w:type="dxa"/>
-              <w:bottom w:w="80" w:type="dxa"/>
-              <w:left w:w="120" w:type="dxa"/>
-              <w:right w:w="120" w:type="dxa"/>
+              <w:top w:w="60" w:type="dxa"/>
+              <w:bottom w:w="60" w:type="dxa"/>
+              <w:left w:w="100" w:type="dxa"/>
+              <w:right w:w="100" w:type="dxa"/>
             </w:tcMar>
           </w:tcPr>
           <w:p>
             <w:r>
               <w:rPr>
-                <w:sz w:val="19"/>
+                <w:sz w:val="17"/>
               </w:rPr>
               <w:t>Rata-rata durasi waktu yang dibutuhkan dari insiden tercatat hingga sistem normal kembali.</w:t>
             </w:r>
@@ -304,20 +311,20 @@
       <w:tr>
         <w:tc>
           <w:tcPr>
-            <w:tcW w:type="dxa" w:w="3010"/>
+            <w:tcW w:type="dxa" w:w="3106"/>
             <w:shd w:fill="F8FAFC"/>
             <w:tcMar>
-              <w:top w:w="80" w:type="dxa"/>
-              <w:bottom w:w="80" w:type="dxa"/>
-              <w:left w:w="120" w:type="dxa"/>
-              <w:right w:w="120" w:type="dxa"/>
+              <w:top w:w="60" w:type="dxa"/>
+              <w:bottom w:w="60" w:type="dxa"/>
+              <w:left w:w="100" w:type="dxa"/>
+              <w:right w:w="100" w:type="dxa"/>
             </w:tcMar>
           </w:tcPr>
           <w:p>
             <w:r>
               <w:rPr>
                 <w:b/>
-                <w:sz w:val="19"/>
+                <w:sz w:val="17"/>
               </w:rPr>
               <w:t>Net MTTR</w:t>
             </w:r>
@@ -325,19 +332,19 @@
         </w:tc>
         <w:tc>
           <w:tcPr>
-            <w:tcW w:type="dxa" w:w="3010"/>
+            <w:tcW w:type="dxa" w:w="3106"/>
             <w:shd w:fill="F8FAFC"/>
             <w:tcMar>
-              <w:top w:w="80" w:type="dxa"/>
-              <w:bottom w:w="80" w:type="dxa"/>
-              <w:left w:w="120" w:type="dxa"/>
-              <w:right w:w="120" w:type="dxa"/>
+              <w:top w:w="60" w:type="dxa"/>
+              <w:bottom w:w="60" w:type="dxa"/>
+              <w:left w:w="100" w:type="dxa"/>
+              <w:right w:w="100" w:type="dxa"/>
             </w:tcMar>
           </w:tcPr>
           <w:p>
             <w:r>
               <w:rPr>
-                <w:sz w:val="19"/>
+                <w:sz w:val="17"/>
               </w:rPr>
               <w:t>Net Mean Time To Resolve</w:t>
             </w:r>
@@ -345,19 +352,19 @@
         </w:tc>
         <w:tc>
           <w:tcPr>
-            <w:tcW w:type="dxa" w:w="3010"/>
+            <w:tcW w:type="dxa" w:w="3106"/>
             <w:shd w:fill="F8FAFC"/>
             <w:tcMar>
-              <w:top w:w="80" w:type="dxa"/>
-              <w:bottom w:w="80" w:type="dxa"/>
-              <w:left w:w="120" w:type="dxa"/>
-              <w:right w:w="120" w:type="dxa"/>
+              <w:top w:w="60" w:type="dxa"/>
+              <w:bottom w:w="60" w:type="dxa"/>
+              <w:left w:w="100" w:type="dxa"/>
+              <w:right w:w="100" w:type="dxa"/>
             </w:tcMar>
           </w:tcPr>
           <w:p>
             <w:r>
               <w:rPr>
-                <w:sz w:val="19"/>
+                <w:sz w:val="17"/>
               </w:rPr>
               <w:t>Durasi penyelesaian bersih setelah dikurangi seluruh akumulasi jeda waktu resmi (SLA Pause).</w:t>
             </w:r>
@@ -367,19 +374,19 @@
       <w:tr>
         <w:tc>
           <w:tcPr>
-            <w:tcW w:type="dxa" w:w="3010"/>
+            <w:tcW w:type="dxa" w:w="3106"/>
             <w:tcMar>
-              <w:top w:w="80" w:type="dxa"/>
-              <w:bottom w:w="80" w:type="dxa"/>
-              <w:left w:w="120" w:type="dxa"/>
-              <w:right w:w="120" w:type="dxa"/>
+              <w:top w:w="60" w:type="dxa"/>
+              <w:bottom w:w="60" w:type="dxa"/>
+              <w:left w:w="100" w:type="dxa"/>
+              <w:right w:w="100" w:type="dxa"/>
             </w:tcMar>
           </w:tcPr>
           <w:p>
             <w:r>
               <w:rPr>
                 <w:b/>
-                <w:sz w:val="19"/>
+                <w:sz w:val="17"/>
               </w:rPr>
               <w:t>RBAC</w:t>
             </w:r>
@@ -387,18 +394,18 @@
         </w:tc>
         <w:tc>
           <w:tcPr>
-            <w:tcW w:type="dxa" w:w="3010"/>
+            <w:tcW w:type="dxa" w:w="3106"/>
             <w:tcMar>
-              <w:top w:w="80" w:type="dxa"/>
-              <w:bottom w:w="80" w:type="dxa"/>
-              <w:left w:w="120" w:type="dxa"/>
-              <w:right w:w="120" w:type="dxa"/>
+              <w:top w:w="60" w:type="dxa"/>
+              <w:bottom w:w="60" w:type="dxa"/>
+              <w:left w:w="100" w:type="dxa"/>
+              <w:right w:w="100" w:type="dxa"/>
             </w:tcMar>
           </w:tcPr>
           <w:p>
             <w:r>
               <w:rPr>
-                <w:sz w:val="19"/>
+                <w:sz w:val="17"/>
               </w:rPr>
               <w:t>Role-Based Access Control</w:t>
             </w:r>
@@ -406,18 +413,18 @@
         </w:tc>
         <w:tc>
           <w:tcPr>
-            <w:tcW w:type="dxa" w:w="3010"/>
+            <w:tcW w:type="dxa" w:w="3106"/>
             <w:tcMar>
-              <w:top w:w="80" w:type="dxa"/>
-              <w:bottom w:w="80" w:type="dxa"/>
-              <w:left w:w="120" w:type="dxa"/>
-              <w:right w:w="120" w:type="dxa"/>
+              <w:top w:w="60" w:type="dxa"/>
+              <w:bottom w:w="60" w:type="dxa"/>
+              <w:left w:w="100" w:type="dxa"/>
+              <w:right w:w="100" w:type="dxa"/>
             </w:tcMar>
           </w:tcPr>
           <w:p>
             <w:r>
               <w:rPr>
-                <w:sz w:val="19"/>
+                <w:sz w:val="17"/>
               </w:rPr>
               <w:t>Metode pembatasan hak akses sistem berdasarkan peran kerja pengguna.</w:t>
             </w:r>
@@ -427,20 +434,20 @@
       <w:tr>
         <w:tc>
           <w:tcPr>
-            <w:tcW w:type="dxa" w:w="3010"/>
+            <w:tcW w:type="dxa" w:w="3106"/>
             <w:shd w:fill="F8FAFC"/>
             <w:tcMar>
-              <w:top w:w="80" w:type="dxa"/>
-              <w:bottom w:w="80" w:type="dxa"/>
-              <w:left w:w="120" w:type="dxa"/>
-              <w:right w:w="120" w:type="dxa"/>
+              <w:top w:w="60" w:type="dxa"/>
+              <w:bottom w:w="60" w:type="dxa"/>
+              <w:left w:w="100" w:type="dxa"/>
+              <w:right w:w="100" w:type="dxa"/>
             </w:tcMar>
           </w:tcPr>
           <w:p>
             <w:r>
               <w:rPr>
                 <w:b/>
-                <w:sz w:val="19"/>
+                <w:sz w:val="17"/>
               </w:rPr>
               <w:t>RCA</w:t>
             </w:r>
@@ -448,19 +455,19 @@
         </w:tc>
         <w:tc>
           <w:tcPr>
-            <w:tcW w:type="dxa" w:w="3010"/>
+            <w:tcW w:type="dxa" w:w="3106"/>
             <w:shd w:fill="F8FAFC"/>
             <w:tcMar>
-              <w:top w:w="80" w:type="dxa"/>
-              <w:bottom w:w="80" w:type="dxa"/>
-              <w:left w:w="120" w:type="dxa"/>
-              <w:right w:w="120" w:type="dxa"/>
+              <w:top w:w="60" w:type="dxa"/>
+              <w:bottom w:w="60" w:type="dxa"/>
+              <w:left w:w="100" w:type="dxa"/>
+              <w:right w:w="100" w:type="dxa"/>
             </w:tcMar>
           </w:tcPr>
           <w:p>
             <w:r>
               <w:rPr>
-                <w:sz w:val="19"/>
+                <w:sz w:val="17"/>
               </w:rPr>
               <w:t>Root Cause Analysis</w:t>
             </w:r>
@@ -468,19 +475,19 @@
         </w:tc>
         <w:tc>
           <w:tcPr>
-            <w:tcW w:type="dxa" w:w="3010"/>
+            <w:tcW w:type="dxa" w:w="3106"/>
             <w:shd w:fill="F8FAFC"/>
             <w:tcMar>
-              <w:top w:w="80" w:type="dxa"/>
-              <w:bottom w:w="80" w:type="dxa"/>
-              <w:left w:w="120" w:type="dxa"/>
-              <w:right w:w="120" w:type="dxa"/>
+              <w:top w:w="60" w:type="dxa"/>
+              <w:bottom w:w="60" w:type="dxa"/>
+              <w:left w:w="100" w:type="dxa"/>
+              <w:right w:w="100" w:type="dxa"/>
             </w:tcMar>
           </w:tcPr>
           <w:p>
             <w:r>
               <w:rPr>
-                <w:sz w:val="19"/>
+                <w:sz w:val="17"/>
               </w:rPr>
               <w:t>Investigasi penelusuran akar penyebab utama terjadinya gangguan teknis.</w:t>
             </w:r>
@@ -490,19 +497,19 @@
       <w:tr>
         <w:tc>
           <w:tcPr>
-            <w:tcW w:type="dxa" w:w="3010"/>
+            <w:tcW w:type="dxa" w:w="3106"/>
             <w:tcMar>
-              <w:top w:w="80" w:type="dxa"/>
-              <w:bottom w:w="80" w:type="dxa"/>
-              <w:left w:w="120" w:type="dxa"/>
-              <w:right w:w="120" w:type="dxa"/>
+              <w:top w:w="60" w:type="dxa"/>
+              <w:bottom w:w="60" w:type="dxa"/>
+              <w:left w:w="100" w:type="dxa"/>
+              <w:right w:w="100" w:type="dxa"/>
             </w:tcMar>
           </w:tcPr>
           <w:p>
             <w:r>
               <w:rPr>
                 <w:b/>
-                <w:sz w:val="19"/>
+                <w:sz w:val="17"/>
               </w:rPr>
               <w:t>KCS</w:t>
             </w:r>
@@ -510,18 +517,18 @@
         </w:tc>
         <w:tc>
           <w:tcPr>
-            <w:tcW w:type="dxa" w:w="3010"/>
+            <w:tcW w:type="dxa" w:w="3106"/>
             <w:tcMar>
-              <w:top w:w="80" w:type="dxa"/>
-              <w:bottom w:w="80" w:type="dxa"/>
-              <w:left w:w="120" w:type="dxa"/>
-              <w:right w:w="120" w:type="dxa"/>
+              <w:top w:w="60" w:type="dxa"/>
+              <w:bottom w:w="60" w:type="dxa"/>
+              <w:left w:w="100" w:type="dxa"/>
+              <w:right w:w="100" w:type="dxa"/>
             </w:tcMar>
           </w:tcPr>
           <w:p>
             <w:r>
               <w:rPr>
-                <w:sz w:val="19"/>
+                <w:sz w:val="17"/>
               </w:rPr>
               <w:t>Knowledge-Centered Service</w:t>
             </w:r>
@@ -529,18 +536,18 @@
         </w:tc>
         <w:tc>
           <w:tcPr>
-            <w:tcW w:type="dxa" w:w="3010"/>
+            <w:tcW w:type="dxa" w:w="3106"/>
             <w:tcMar>
-              <w:top w:w="80" w:type="dxa"/>
-              <w:bottom w:w="80" w:type="dxa"/>
-              <w:left w:w="120" w:type="dxa"/>
-              <w:right w:w="120" w:type="dxa"/>
+              <w:top w:w="60" w:type="dxa"/>
+              <w:bottom w:w="60" w:type="dxa"/>
+              <w:left w:w="100" w:type="dxa"/>
+              <w:right w:w="100" w:type="dxa"/>
             </w:tcMar>
           </w:tcPr>
           <w:p>
             <w:r>
               <w:rPr>
-                <w:sz w:val="19"/>
+                <w:sz w:val="17"/>
               </w:rPr>
               <w:t>Metodologi standardisasi perbaikan insiden menjadi dokumen panduan teknis (SOP / Runbook).</w:t>
             </w:r>
@@ -550,20 +557,20 @@
       <w:tr>
         <w:tc>
           <w:tcPr>
-            <w:tcW w:type="dxa" w:w="3010"/>
+            <w:tcW w:type="dxa" w:w="3106"/>
             <w:shd w:fill="F8FAFC"/>
             <w:tcMar>
-              <w:top w:w="80" w:type="dxa"/>
-              <w:bottom w:w="80" w:type="dxa"/>
-              <w:left w:w="120" w:type="dxa"/>
-              <w:right w:w="120" w:type="dxa"/>
+              <w:top w:w="60" w:type="dxa"/>
+              <w:bottom w:w="60" w:type="dxa"/>
+              <w:left w:w="100" w:type="dxa"/>
+              <w:right w:w="100" w:type="dxa"/>
             </w:tcMar>
           </w:tcPr>
           <w:p>
             <w:r>
               <w:rPr>
                 <w:b/>
-                <w:sz w:val="19"/>
+                <w:sz w:val="17"/>
               </w:rPr>
               <w:t>SMTP</w:t>
             </w:r>
@@ -571,19 +578,19 @@
         </w:tc>
         <w:tc>
           <w:tcPr>
-            <w:tcW w:type="dxa" w:w="3010"/>
+            <w:tcW w:type="dxa" w:w="3106"/>
             <w:shd w:fill="F8FAFC"/>
             <w:tcMar>
-              <w:top w:w="80" w:type="dxa"/>
-              <w:bottom w:w="80" w:type="dxa"/>
-              <w:left w:w="120" w:type="dxa"/>
-              <w:right w:w="120" w:type="dxa"/>
+              <w:top w:w="60" w:type="dxa"/>
+              <w:bottom w:w="60" w:type="dxa"/>
+              <w:left w:w="100" w:type="dxa"/>
+              <w:right w:w="100" w:type="dxa"/>
             </w:tcMar>
           </w:tcPr>
           <w:p>
             <w:r>
               <w:rPr>
-                <w:sz w:val="19"/>
+                <w:sz w:val="17"/>
               </w:rPr>
               <w:t>Simple Mail Transfer Protocol</w:t>
             </w:r>
@@ -591,19 +598,19 @@
         </w:tc>
         <w:tc>
           <w:tcPr>
-            <w:tcW w:type="dxa" w:w="3010"/>
+            <w:tcW w:type="dxa" w:w="3106"/>
             <w:shd w:fill="F8FAFC"/>
             <w:tcMar>
-              <w:top w:w="80" w:type="dxa"/>
-              <w:bottom w:w="80" w:type="dxa"/>
-              <w:left w:w="120" w:type="dxa"/>
-              <w:right w:w="120" w:type="dxa"/>
+              <w:top w:w="60" w:type="dxa"/>
+              <w:bottom w:w="60" w:type="dxa"/>
+              <w:left w:w="100" w:type="dxa"/>
+              <w:right w:w="100" w:type="dxa"/>
             </w:tcMar>
           </w:tcPr>
           <w:p>
             <w:r>
               <w:rPr>
-                <w:sz w:val="19"/>
+                <w:sz w:val="17"/>
               </w:rPr>
               <w:t>Protokol standar jaringan untuk pengiriman surat elektronik resmi.</w:t>
             </w:r>
@@ -613,19 +620,19 @@
       <w:tr>
         <w:tc>
           <w:tcPr>
-            <w:tcW w:type="dxa" w:w="3010"/>
+            <w:tcW w:type="dxa" w:w="3106"/>
             <w:tcMar>
-              <w:top w:w="80" w:type="dxa"/>
-              <w:bottom w:w="80" w:type="dxa"/>
-              <w:left w:w="120" w:type="dxa"/>
-              <w:right w:w="120" w:type="dxa"/>
+              <w:top w:w="60" w:type="dxa"/>
+              <w:bottom w:w="60" w:type="dxa"/>
+              <w:left w:w="100" w:type="dxa"/>
+              <w:right w:w="100" w:type="dxa"/>
             </w:tcMar>
           </w:tcPr>
           <w:p>
             <w:r>
               <w:rPr>
                 <w:b/>
-                <w:sz w:val="19"/>
+                <w:sz w:val="17"/>
               </w:rPr>
               <w:t>SPA</w:t>
             </w:r>
@@ -633,18 +640,18 @@
         </w:tc>
         <w:tc>
           <w:tcPr>
-            <w:tcW w:type="dxa" w:w="3010"/>
+            <w:tcW w:type="dxa" w:w="3106"/>
             <w:tcMar>
-              <w:top w:w="80" w:type="dxa"/>
-              <w:bottom w:w="80" w:type="dxa"/>
-              <w:left w:w="120" w:type="dxa"/>
-              <w:right w:w="120" w:type="dxa"/>
+              <w:top w:w="60" w:type="dxa"/>
+              <w:bottom w:w="60" w:type="dxa"/>
+              <w:left w:w="100" w:type="dxa"/>
+              <w:right w:w="100" w:type="dxa"/>
             </w:tcMar>
           </w:tcPr>
           <w:p>
             <w:r>
               <w:rPr>
-                <w:sz w:val="19"/>
+                <w:sz w:val="17"/>
               </w:rPr>
               <w:t>Single Page Application</w:t>
             </w:r>
@@ -652,18 +659,18 @@
         </w:tc>
         <w:tc>
           <w:tcPr>
-            <w:tcW w:type="dxa" w:w="3010"/>
+            <w:tcW w:type="dxa" w:w="3106"/>
             <w:tcMar>
-              <w:top w:w="80" w:type="dxa"/>
-              <w:bottom w:w="80" w:type="dxa"/>
-              <w:left w:w="120" w:type="dxa"/>
-              <w:right w:w="120" w:type="dxa"/>
+              <w:top w:w="60" w:type="dxa"/>
+              <w:bottom w:w="60" w:type="dxa"/>
+              <w:left w:w="100" w:type="dxa"/>
+              <w:right w:w="100" w:type="dxa"/>
             </w:tcMar>
           </w:tcPr>
           <w:p>
             <w:r>
               <w:rPr>
-                <w:sz w:val="19"/>
+                <w:sz w:val="17"/>
               </w:rPr>
               <w:t>Arsitektur web yang memuat satu halaman dinamis tanpa memuat ulang seluruh halaman peramban.</w:t>
             </w:r>
@@ -673,20 +680,20 @@
       <w:tr>
         <w:tc>
           <w:tcPr>
-            <w:tcW w:type="dxa" w:w="3010"/>
+            <w:tcW w:type="dxa" w:w="3106"/>
             <w:shd w:fill="F8FAFC"/>
             <w:tcMar>
-              <w:top w:w="80" w:type="dxa"/>
-              <w:bottom w:w="80" w:type="dxa"/>
-              <w:left w:w="120" w:type="dxa"/>
-              <w:right w:w="120" w:type="dxa"/>
+              <w:top w:w="60" w:type="dxa"/>
+              <w:bottom w:w="60" w:type="dxa"/>
+              <w:left w:w="100" w:type="dxa"/>
+              <w:right w:w="100" w:type="dxa"/>
             </w:tcMar>
           </w:tcPr>
           <w:p>
             <w:r>
               <w:rPr>
                 <w:b/>
-                <w:sz w:val="19"/>
+                <w:sz w:val="17"/>
               </w:rPr>
               <w:t>PKS</w:t>
             </w:r>
@@ -694,19 +701,19 @@
         </w:tc>
         <w:tc>
           <w:tcPr>
-            <w:tcW w:type="dxa" w:w="3010"/>
+            <w:tcW w:type="dxa" w:w="3106"/>
             <w:shd w:fill="F8FAFC"/>
             <w:tcMar>
-              <w:top w:w="80" w:type="dxa"/>
-              <w:bottom w:w="80" w:type="dxa"/>
-              <w:left w:w="120" w:type="dxa"/>
-              <w:right w:w="120" w:type="dxa"/>
+              <w:top w:w="60" w:type="dxa"/>
+              <w:bottom w:w="60" w:type="dxa"/>
+              <w:left w:w="100" w:type="dxa"/>
+              <w:right w:w="100" w:type="dxa"/>
             </w:tcMar>
           </w:tcPr>
           <w:p>
             <w:r>
               <w:rPr>
-                <w:sz w:val="19"/>
+                <w:sz w:val="17"/>
               </w:rPr>
               <w:t>Perjanjian Kerja Sama</w:t>
             </w:r>
@@ -714,19 +721,19 @@
         </w:tc>
         <w:tc>
           <w:tcPr>
-            <w:tcW w:type="dxa" w:w="3010"/>
+            <w:tcW w:type="dxa" w:w="3106"/>
             <w:shd w:fill="F8FAFC"/>
             <w:tcMar>
-              <w:top w:w="80" w:type="dxa"/>
-              <w:bottom w:w="80" w:type="dxa"/>
-              <w:left w:w="120" w:type="dxa"/>
-              <w:right w:w="120" w:type="dxa"/>
+              <w:top w:w="60" w:type="dxa"/>
+              <w:bottom w:w="60" w:type="dxa"/>
+              <w:left w:w="100" w:type="dxa"/>
+              <w:right w:w="100" w:type="dxa"/>
             </w:tcMar>
           </w:tcPr>
           <w:p>
             <w:r>
               <w:rPr>
-                <w:sz w:val="19"/>
+                <w:sz w:val="17"/>
               </w:rPr>
               <w:t>Dokumen kontrak tingkat layanan antara penyedia layanan dengan mitra perusahaan.</w:t>
             </w:r>
@@ -736,27 +743,81 @@
     </w:tbl>
     <w:p>
       <w:pPr>
-        <w:spacing w:after="200"/>
+        <w:spacing w:after="160"/>
       </w:pPr>
     </w:p>
     <w:p>
       <w:pPr>
-        <w:spacing w:before="280" w:after="80"/>
+        <w:spacing w:before="200" w:after="80"/>
       </w:pPr>
       <w:r>
         <w:rPr>
           <w:b/>
-          <w:sz w:val="24"/>
+          <w:sz w:val="23"/>
         </w:rPr>
         <w:t>1. ARSITEKTUR SISTEM FULL-STACK</w:t>
       </w:r>
     </w:p>
     <w:p>
       <w:pPr>
-        <w:spacing w:after="160"/>
+        <w:spacing w:after="120"/>
       </w:pPr>
       <w:r>
-        <w:t>Sistem dirancang menggunakan arsitektur berlapis (multi-tier) yang memisahkan lapisan presentasi antarmuka berbasis Vue.js 3, lapisan pemrosesan logika bisnis berbasis Express.js (Node.js), lapisan persistensi basis data relasional MySQL, dan lapisan integrasi komunikasi surel resmi melalui SMTP Relay.</w:t>
+        <w:t>Sistem dirancang dengan arsitektur berlapis (multi-tier architecture) yang menghubungkan antarmuka pengguna berbasis Vue.js 3, backend pemrosesan logika bisnis berbasis Express.js (Node.js), basis data relasional MySQL, dan pengiriman notifikasi surat elektronik melalui SMTP Relay:</w:t>
+      </w:r>
+    </w:p>
+    <w:p>
+      <w:pPr>
+        <w:spacing w:before="80" w:after="80"/>
+        <w:jc w:val="center"/>
+      </w:pPr>
+      <w:r>
+        <w:drawing>
+          <wp:inline xmlns:a="http://schemas.openxmlformats.org/drawingml/2006/main" xmlns:pic="http://schemas.openxmlformats.org/drawingml/2006/picture">
+            <wp:extent cx="5852160" cy="2660073"/>
+            <wp:docPr id="1" name="Picture 1"/>
+            <wp:cNvGraphicFramePr>
+              <a:graphicFrameLocks noChangeAspect="1"/>
+            </wp:cNvGraphicFramePr>
+            <a:graphic>
+              <a:graphicData uri="http://schemas.openxmlformats.org/drawingml/2006/picture">
+                <pic:pic>
+                  <pic:nvPicPr>
+                    <pic:cNvPr id="0" name="diagram_arsitektur.png"/>
+                    <pic:cNvPicPr/>
+                  </pic:nvPicPr>
+                  <pic:blipFill>
+                    <a:blip r:embed="rId9"/>
+                    <a:stretch>
+                      <a:fillRect/>
+                    </a:stretch>
+                  </pic:blipFill>
+                  <pic:spPr>
+                    <a:xfrm>
+                      <a:off x="0" y="0"/>
+                      <a:ext cx="5852160" cy="2660073"/>
+                    </a:xfrm>
+                    <a:prstGeom prst="rect"/>
+                  </pic:spPr>
+                </pic:pic>
+              </a:graphicData>
+            </a:graphic>
+          </wp:inline>
+        </w:drawing>
+      </w:r>
+    </w:p>
+    <w:p>
+      <w:pPr>
+        <w:spacing w:after="160"/>
+        <w:jc w:val="center"/>
+      </w:pPr>
+      <w:r>
+        <w:rPr>
+          <w:i/>
+          <w:color w:val="475569"/>
+          <w:sz w:val="17"/>
+        </w:rPr>
+        <w:t>Gambar 1.1 Diagram Arsitektur Sistem Full-Stack (Vue.js, Express.js, MySQL, SMTP Relay)</w:t>
       </w:r>
     </w:p>
     <w:tbl>
@@ -764,50 +825,58 @@
         <w:tblW w:type="auto" w:w="0"/>
         <w:jc w:val="center"/>
         <w:tblLook w:firstColumn="1" w:firstRow="1" w:lastColumn="0" w:lastRow="0" w:noHBand="0" w:noVBand="1" w:val="04A0"/>
+        <w:tblBorders>
+          <w:top w:val="single" w:sz="4" w:space="0" w:color="CBD5E1"/>
+          <w:bottom w:val="single" w:sz="4" w:space="0" w:color="CBD5E1"/>
+          <w:left w:val="single" w:sz="4" w:space="0" w:color="CBD5E1"/>
+          <w:right w:val="single" w:sz="4" w:space="0" w:color="CBD5E1"/>
+          <w:insideH w:val="single" w:sz="4" w:space="0" w:color="CBD5E1"/>
+          <w:insideV w:val="single" w:sz="4" w:space="0" w:color="CBD5E1"/>
+        </w:tblBorders>
       </w:tblPr>
       <w:tblGrid>
-        <w:gridCol w:w="3010"/>
-        <w:gridCol w:w="3010"/>
-        <w:gridCol w:w="3010"/>
+        <w:gridCol w:w="3106"/>
+        <w:gridCol w:w="3106"/>
+        <w:gridCol w:w="3106"/>
       </w:tblGrid>
       <w:tr>
         <w:tc>
           <w:tcPr>
-            <w:tcW w:type="dxa" w:w="3010"/>
+            <w:tcW w:type="dxa" w:w="3106"/>
             <w:shd w:fill="F1F5F9"/>
             <w:tcMar>
-              <w:top w:w="100" w:type="dxa"/>
-              <w:bottom w:w="100" w:type="dxa"/>
-              <w:left w:w="120" w:type="dxa"/>
-              <w:right w:w="120" w:type="dxa"/>
+              <w:top w:w="80" w:type="dxa"/>
+              <w:bottom w:w="80" w:type="dxa"/>
+              <w:left w:w="100" w:type="dxa"/>
+              <w:right w:w="100" w:type="dxa"/>
             </w:tcMar>
           </w:tcPr>
           <w:p>
             <w:r>
               <w:rPr>
                 <w:b/>
-                <w:sz w:val="19"/>
+                <w:sz w:val="18"/>
               </w:rPr>
-              <w:t>Lapisan Sistem</w:t>
+              <w:t>Komponen Sistem</w:t>
             </w:r>
           </w:p>
         </w:tc>
         <w:tc>
           <w:tcPr>
-            <w:tcW w:type="dxa" w:w="3010"/>
+            <w:tcW w:type="dxa" w:w="3106"/>
             <w:shd w:fill="F1F5F9"/>
             <w:tcMar>
-              <w:top w:w="100" w:type="dxa"/>
-              <w:bottom w:w="100" w:type="dxa"/>
-              <w:left w:w="120" w:type="dxa"/>
-              <w:right w:w="120" w:type="dxa"/>
+              <w:top w:w="80" w:type="dxa"/>
+              <w:bottom w:w="80" w:type="dxa"/>
+              <w:left w:w="100" w:type="dxa"/>
+              <w:right w:w="100" w:type="dxa"/>
             </w:tcMar>
           </w:tcPr>
           <w:p>
             <w:r>
               <w:rPr>
                 <w:b/>
-                <w:sz w:val="19"/>
+                <w:sz w:val="18"/>
               </w:rPr>
               <w:t>Teknologi Terpilih</w:t>
             </w:r>
@@ -815,20 +884,20 @@
         </w:tc>
         <w:tc>
           <w:tcPr>
-            <w:tcW w:type="dxa" w:w="3010"/>
+            <w:tcW w:type="dxa" w:w="3106"/>
             <w:shd w:fill="F1F5F9"/>
             <w:tcMar>
-              <w:top w:w="100" w:type="dxa"/>
-              <w:bottom w:w="100" w:type="dxa"/>
-              <w:left w:w="120" w:type="dxa"/>
-              <w:right w:w="120" w:type="dxa"/>
+              <w:top w:w="80" w:type="dxa"/>
+              <w:bottom w:w="80" w:type="dxa"/>
+              <w:left w:w="100" w:type="dxa"/>
+              <w:right w:w="100" w:type="dxa"/>
             </w:tcMar>
           </w:tcPr>
           <w:p>
             <w:r>
               <w:rPr>
                 <w:b/>
-                <w:sz w:val="19"/>
+                <w:sz w:val="18"/>
               </w:rPr>
               <w:t>Peran &amp; Fungsi dalam Rancangan</w:t>
             </w:r>
@@ -838,38 +907,38 @@
       <w:tr>
         <w:tc>
           <w:tcPr>
-            <w:tcW w:type="dxa" w:w="3010"/>
+            <w:tcW w:type="dxa" w:w="3106"/>
             <w:tcMar>
-              <w:top w:w="80" w:type="dxa"/>
-              <w:bottom w:w="80" w:type="dxa"/>
-              <w:left w:w="120" w:type="dxa"/>
-              <w:right w:w="120" w:type="dxa"/>
+              <w:top w:w="60" w:type="dxa"/>
+              <w:bottom w:w="60" w:type="dxa"/>
+              <w:left w:w="100" w:type="dxa"/>
+              <w:right w:w="100" w:type="dxa"/>
             </w:tcMar>
           </w:tcPr>
           <w:p>
             <w:r>
               <w:rPr>
                 <w:b/>
-                <w:sz w:val="19"/>
+                <w:sz w:val="17"/>
               </w:rPr>
-              <w:t>1. Lapisan Antarmuka Pengguna (Frontend)</w:t>
+              <w:t>Lapisan Antarmuka</w:t>
             </w:r>
           </w:p>
         </w:tc>
         <w:tc>
           <w:tcPr>
-            <w:tcW w:type="dxa" w:w="3010"/>
+            <w:tcW w:type="dxa" w:w="3106"/>
             <w:tcMar>
-              <w:top w:w="80" w:type="dxa"/>
-              <w:bottom w:w="80" w:type="dxa"/>
-              <w:left w:w="120" w:type="dxa"/>
-              <w:right w:w="120" w:type="dxa"/>
+              <w:top w:w="60" w:type="dxa"/>
+              <w:bottom w:w="60" w:type="dxa"/>
+              <w:left w:w="100" w:type="dxa"/>
+              <w:right w:w="100" w:type="dxa"/>
             </w:tcMar>
           </w:tcPr>
           <w:p>
             <w:r>
               <w:rPr>
-                <w:sz w:val="19"/>
+                <w:sz w:val="17"/>
               </w:rPr>
               <w:t>Vue 3, Vite, Pinia, Vue Router</w:t>
             </w:r>
@@ -877,20 +946,20 @@
         </w:tc>
         <w:tc>
           <w:tcPr>
-            <w:tcW w:type="dxa" w:w="3010"/>
+            <w:tcW w:type="dxa" w:w="3106"/>
             <w:tcMar>
-              <w:top w:w="80" w:type="dxa"/>
-              <w:bottom w:w="80" w:type="dxa"/>
-              <w:left w:w="120" w:type="dxa"/>
-              <w:right w:w="120" w:type="dxa"/>
+              <w:top w:w="60" w:type="dxa"/>
+              <w:bottom w:w="60" w:type="dxa"/>
+              <w:left w:w="100" w:type="dxa"/>
+              <w:right w:w="100" w:type="dxa"/>
             </w:tcMar>
           </w:tcPr>
           <w:p>
             <w:r>
               <w:rPr>
-                <w:sz w:val="19"/>
+                <w:sz w:val="17"/>
               </w:rPr>
-              <w:t>Menyediakan antarmuka interaktif bagi Helpdesk, ruang kerja diagnosa teknisi, dan portal tracking pelanggan berbasis URL token.</w:t>
+              <w:t>Menyediakan antarmuka interaktif bagi staf Helpdesk, lembar kerja diagnosa teknisi, dan portal tracking publik bagi pelanggan.</w:t>
             </w:r>
           </w:p>
         </w:tc>
@@ -898,40 +967,40 @@
       <w:tr>
         <w:tc>
           <w:tcPr>
-            <w:tcW w:type="dxa" w:w="3010"/>
+            <w:tcW w:type="dxa" w:w="3106"/>
             <w:shd w:fill="F8FAFC"/>
             <w:tcMar>
-              <w:top w:w="80" w:type="dxa"/>
-              <w:bottom w:w="80" w:type="dxa"/>
-              <w:left w:w="120" w:type="dxa"/>
-              <w:right w:w="120" w:type="dxa"/>
+              <w:top w:w="60" w:type="dxa"/>
+              <w:bottom w:w="60" w:type="dxa"/>
+              <w:left w:w="100" w:type="dxa"/>
+              <w:right w:w="100" w:type="dxa"/>
             </w:tcMar>
           </w:tcPr>
           <w:p>
             <w:r>
               <w:rPr>
                 <w:b/>
-                <w:sz w:val="19"/>
+                <w:sz w:val="17"/>
               </w:rPr>
-              <w:t>2. Layanan Backend (API Tier)</w:t>
+              <w:t>Layanan Backend</w:t>
             </w:r>
           </w:p>
         </w:tc>
         <w:tc>
           <w:tcPr>
-            <w:tcW w:type="dxa" w:w="3010"/>
+            <w:tcW w:type="dxa" w:w="3106"/>
             <w:shd w:fill="F8FAFC"/>
             <w:tcMar>
-              <w:top w:w="80" w:type="dxa"/>
-              <w:bottom w:w="80" w:type="dxa"/>
-              <w:left w:w="120" w:type="dxa"/>
-              <w:right w:w="120" w:type="dxa"/>
+              <w:top w:w="60" w:type="dxa"/>
+              <w:bottom w:w="60" w:type="dxa"/>
+              <w:left w:w="100" w:type="dxa"/>
+              <w:right w:w="100" w:type="dxa"/>
             </w:tcMar>
           </w:tcPr>
           <w:p>
             <w:r>
               <w:rPr>
-                <w:sz w:val="19"/>
+                <w:sz w:val="17"/>
               </w:rPr>
               <w:t>Express.js, Node-Cron, Nodemailer</w:t>
             </w:r>
@@ -939,21 +1008,21 @@
         </w:tc>
         <w:tc>
           <w:tcPr>
-            <w:tcW w:type="dxa" w:w="3010"/>
+            <w:tcW w:type="dxa" w:w="3106"/>
             <w:shd w:fill="F8FAFC"/>
             <w:tcMar>
-              <w:top w:w="80" w:type="dxa"/>
-              <w:bottom w:w="80" w:type="dxa"/>
-              <w:left w:w="120" w:type="dxa"/>
-              <w:right w:w="120" w:type="dxa"/>
+              <w:top w:w="60" w:type="dxa"/>
+              <w:bottom w:w="60" w:type="dxa"/>
+              <w:left w:w="100" w:type="dxa"/>
+              <w:right w:w="100" w:type="dxa"/>
             </w:tcMar>
           </w:tcPr>
           <w:p>
             <w:r>
               <w:rPr>
-                <w:sz w:val="19"/>
+                <w:sz w:val="17"/>
               </w:rPr>
-              <w:t>Menyediakan endpoint REST API, menjalankan validasi RBAC, menghitung batas waktu SLA, menangani jeda SLA, dan mengeksekusi cron monitoring berkala.</w:t>
+              <w:t>Memproses endpoint REST API, menjalankan validasi RBAC, menghitung batas SLA, serta mengeksekusi cron monitoring berkala.</w:t>
             </w:r>
           </w:p>
         </w:tc>
@@ -961,38 +1030,38 @@
       <w:tr>
         <w:tc>
           <w:tcPr>
-            <w:tcW w:type="dxa" w:w="3010"/>
+            <w:tcW w:type="dxa" w:w="3106"/>
             <w:tcMar>
-              <w:top w:w="80" w:type="dxa"/>
-              <w:bottom w:w="80" w:type="dxa"/>
-              <w:left w:w="120" w:type="dxa"/>
-              <w:right w:w="120" w:type="dxa"/>
+              <w:top w:w="60" w:type="dxa"/>
+              <w:bottom w:w="60" w:type="dxa"/>
+              <w:left w:w="100" w:type="dxa"/>
+              <w:right w:w="100" w:type="dxa"/>
             </w:tcMar>
           </w:tcPr>
           <w:p>
             <w:r>
               <w:rPr>
                 <w:b/>
-                <w:sz w:val="19"/>
+                <w:sz w:val="17"/>
               </w:rPr>
-              <w:t>3. Basis Data Relasional (Data Tier)</w:t>
+              <w:t>Basis Data Relasional</w:t>
             </w:r>
           </w:p>
         </w:tc>
         <w:tc>
           <w:tcPr>
-            <w:tcW w:type="dxa" w:w="3010"/>
+            <w:tcW w:type="dxa" w:w="3106"/>
             <w:tcMar>
-              <w:top w:w="80" w:type="dxa"/>
-              <w:bottom w:w="80" w:type="dxa"/>
-              <w:left w:w="120" w:type="dxa"/>
-              <w:right w:w="120" w:type="dxa"/>
+              <w:top w:w="60" w:type="dxa"/>
+              <w:bottom w:w="60" w:type="dxa"/>
+              <w:left w:w="100" w:type="dxa"/>
+              <w:right w:w="100" w:type="dxa"/>
             </w:tcMar>
           </w:tcPr>
           <w:p>
             <w:r>
               <w:rPr>
-                <w:sz w:val="19"/>
+                <w:sz w:val="17"/>
               </w:rPr>
               <w:t>MySQL (Engine InnoDB)</w:t>
             </w:r>
@@ -1000,20 +1069,20 @@
         </w:tc>
         <w:tc>
           <w:tcPr>
-            <w:tcW w:type="dxa" w:w="3010"/>
+            <w:tcW w:type="dxa" w:w="3106"/>
             <w:tcMar>
-              <w:top w:w="80" w:type="dxa"/>
-              <w:bottom w:w="80" w:type="dxa"/>
-              <w:left w:w="120" w:type="dxa"/>
-              <w:right w:w="120" w:type="dxa"/>
+              <w:top w:w="60" w:type="dxa"/>
+              <w:bottom w:w="60" w:type="dxa"/>
+              <w:left w:w="100" w:type="dxa"/>
+              <w:right w:w="100" w:type="dxa"/>
             </w:tcMar>
           </w:tcPr>
           <w:p>
             <w:r>
               <w:rPr>
-                <w:sz w:val="19"/>
+                <w:sz w:val="17"/>
               </w:rPr>
-              <w:t>Menyimpan seluruh tabel operasional tiket, relasi pelanggan, kebijakan SLA, riwayat jeda, dan catatan rekam audit dengan dukungan transaksi ACID.</w:t>
+              <w:t>Menyimpan seluruh tabel operasional tiket, relasi pelanggan, kebijakan SLA, riwayat jeda, dan catatan rekam audit.</w:t>
             </w:r>
           </w:p>
         </w:tc>
@@ -1021,40 +1090,40 @@
       <w:tr>
         <w:tc>
           <w:tcPr>
-            <w:tcW w:type="dxa" w:w="3010"/>
+            <w:tcW w:type="dxa" w:w="3106"/>
             <w:shd w:fill="F8FAFC"/>
             <w:tcMar>
-              <w:top w:w="80" w:type="dxa"/>
-              <w:bottom w:w="80" w:type="dxa"/>
-              <w:left w:w="120" w:type="dxa"/>
-              <w:right w:w="120" w:type="dxa"/>
+              <w:top w:w="60" w:type="dxa"/>
+              <w:bottom w:w="60" w:type="dxa"/>
+              <w:left w:w="100" w:type="dxa"/>
+              <w:right w:w="100" w:type="dxa"/>
             </w:tcMar>
           </w:tcPr>
           <w:p>
             <w:r>
               <w:rPr>
                 <w:b/>
-                <w:sz w:val="19"/>
+                <w:sz w:val="17"/>
               </w:rPr>
-              <w:t>4. Layanan Notifikasi (Integration)</w:t>
+              <w:t>Layanan Notifikasi</w:t>
             </w:r>
           </w:p>
         </w:tc>
         <w:tc>
           <w:tcPr>
-            <w:tcW w:type="dxa" w:w="3010"/>
+            <w:tcW w:type="dxa" w:w="3106"/>
             <w:shd w:fill="F8FAFC"/>
             <w:tcMar>
-              <w:top w:w="80" w:type="dxa"/>
-              <w:bottom w:w="80" w:type="dxa"/>
-              <w:left w:w="120" w:type="dxa"/>
-              <w:right w:w="120" w:type="dxa"/>
+              <w:top w:w="60" w:type="dxa"/>
+              <w:bottom w:w="60" w:type="dxa"/>
+              <w:left w:w="100" w:type="dxa"/>
+              <w:right w:w="100" w:type="dxa"/>
             </w:tcMar>
           </w:tcPr>
           <w:p>
             <w:r>
               <w:rPr>
-                <w:sz w:val="19"/>
+                <w:sz w:val="17"/>
               </w:rPr>
               <w:t>SMTP Relay Server</w:t>
             </w:r>
@@ -1062,19 +1131,19 @@
         </w:tc>
         <w:tc>
           <w:tcPr>
-            <w:tcW w:type="dxa" w:w="3010"/>
+            <w:tcW w:type="dxa" w:w="3106"/>
             <w:shd w:fill="F8FAFC"/>
             <w:tcMar>
-              <w:top w:w="80" w:type="dxa"/>
-              <w:bottom w:w="80" w:type="dxa"/>
-              <w:left w:w="120" w:type="dxa"/>
-              <w:right w:w="120" w:type="dxa"/>
+              <w:top w:w="60" w:type="dxa"/>
+              <w:bottom w:w="60" w:type="dxa"/>
+              <w:left w:w="100" w:type="dxa"/>
+              <w:right w:w="100" w:type="dxa"/>
             </w:tcMar>
           </w:tcPr>
           <w:p>
             <w:r>
               <w:rPr>
-                <w:sz w:val="19"/>
+                <w:sz w:val="17"/>
               </w:rPr>
               <w:t>Mengirimkan pembaruan status tiket dan surat peringatan eskalasi resmi langsung ke kotak masuk surel teknisi dan klien.</w:t>
             </w:r>
@@ -1089,22 +1158,22 @@
     </w:p>
     <w:p>
       <w:pPr>
-        <w:spacing w:before="200" w:after="80"/>
+        <w:spacing w:before="160" w:after="80"/>
       </w:pPr>
       <w:r>
         <w:rPr>
           <w:b/>
-          <w:sz w:val="24"/>
+          <w:sz w:val="23"/>
         </w:rPr>
         <w:t>2. MATRIKS HAK AKSES PENGGUNA (RBAC MATRIX)</w:t>
       </w:r>
     </w:p>
     <w:p>
       <w:pPr>
-        <w:spacing w:after="160"/>
+        <w:spacing w:after="120"/>
       </w:pPr>
       <w:r>
-        <w:t>Matriks ini mendefinisikan pembatasan kewenangan operasional antara Admin / CPIG (sebagai Helpdesk Dispatcher) dengan Support Engineer (staf teknis pelaksana penanganan), serta akses terbatas pada Portal Klien:</w:t>
+        <w:t>Pembagian hak akses memisahkan tugas ADMIN / CPIG (sebagai Helpdesk Dispatcher yang mengatur antrean dan penugasan) dengan SUPPORT ENGINEER (sebagai teknisi pelaksana investigasi dan perbaikan), serta membatasi akses PORTAL KLIEN:</w:t>
       </w:r>
     </w:p>
     <w:tbl>
@@ -1112,33 +1181,38 @@
         <w:tblW w:type="auto" w:w="0"/>
         <w:jc w:val="center"/>
         <w:tblLook w:firstColumn="1" w:firstRow="1" w:lastColumn="0" w:lastRow="0" w:noHBand="0" w:noVBand="1" w:val="04A0"/>
+        <w:tblBorders>
+          <w:top w:val="single" w:sz="4" w:space="0" w:color="CBD5E1"/>
+          <w:bottom w:val="single" w:sz="4" w:space="0" w:color="CBD5E1"/>
+          <w:left w:val="single" w:sz="4" w:space="0" w:color="CBD5E1"/>
+          <w:right w:val="single" w:sz="4" w:space="0" w:color="CBD5E1"/>
+          <w:insideH w:val="single" w:sz="4" w:space="0" w:color="CBD5E1"/>
+          <w:insideV w:val="single" w:sz="4" w:space="0" w:color="CBD5E1"/>
+        </w:tblBorders>
       </w:tblPr>
       <w:tblGrid>
-        <w:gridCol w:w="2257"/>
-        <w:gridCol w:w="2257"/>
-        <w:gridCol w:w="2257"/>
-        <w:gridCol w:w="2257"/>
+        <w:gridCol w:w="2329"/>
+        <w:gridCol w:w="2329"/>
+        <w:gridCol w:w="2329"/>
+        <w:gridCol w:w="2329"/>
       </w:tblGrid>
       <w:tr>
         <w:tc>
           <w:tcPr>
-            <w:tcW w:type="dxa" w:w="2257"/>
+            <w:tcW w:type="dxa" w:w="2329"/>
             <w:shd w:fill="F1F5F9"/>
             <w:tcMar>
-              <w:top w:w="100" w:type="dxa"/>
-              <w:bottom w:w="100" w:type="dxa"/>
-              <w:left w:w="120" w:type="dxa"/>
-              <w:right w:w="120" w:type="dxa"/>
+              <w:top w:w="80" w:type="dxa"/>
+              <w:bottom w:w="80" w:type="dxa"/>
+              <w:left w:w="100" w:type="dxa"/>
+              <w:right w:w="100" w:type="dxa"/>
             </w:tcMar>
           </w:tcPr>
           <w:p>
-            <w:pPr>
-              <w:jc w:val="left"/>
-            </w:pPr>
             <w:r>
               <w:rPr>
                 <w:b/>
-                <w:sz w:val="18"/>
+                <w:sz w:val="17"/>
               </w:rPr>
               <w:t>Fungsi / Modul Sistem</w:t>
             </w:r>
@@ -1146,13 +1220,13 @@
         </w:tc>
         <w:tc>
           <w:tcPr>
-            <w:tcW w:type="dxa" w:w="2257"/>
+            <w:tcW w:type="dxa" w:w="2329"/>
             <w:shd w:fill="F1F5F9"/>
             <w:tcMar>
-              <w:top w:w="100" w:type="dxa"/>
-              <w:bottom w:w="100" w:type="dxa"/>
-              <w:left w:w="120" w:type="dxa"/>
-              <w:right w:w="120" w:type="dxa"/>
+              <w:top w:w="80" w:type="dxa"/>
+              <w:bottom w:w="80" w:type="dxa"/>
+              <w:left w:w="100" w:type="dxa"/>
+              <w:right w:w="100" w:type="dxa"/>
             </w:tcMar>
           </w:tcPr>
           <w:p>
@@ -1162,7 +1236,7 @@
             <w:r>
               <w:rPr>
                 <w:b/>
-                <w:sz w:val="18"/>
+                <w:sz w:val="17"/>
               </w:rPr>
               <w:t>ADMIN / CPIG</w:t>
               <w:br/>
@@ -1172,13 +1246,13 @@
         </w:tc>
         <w:tc>
           <w:tcPr>
-            <w:tcW w:type="dxa" w:w="2257"/>
+            <w:tcW w:type="dxa" w:w="2329"/>
             <w:shd w:fill="F1F5F9"/>
             <w:tcMar>
-              <w:top w:w="100" w:type="dxa"/>
-              <w:bottom w:w="100" w:type="dxa"/>
-              <w:left w:w="120" w:type="dxa"/>
-              <w:right w:w="120" w:type="dxa"/>
+              <w:top w:w="80" w:type="dxa"/>
+              <w:bottom w:w="80" w:type="dxa"/>
+              <w:left w:w="100" w:type="dxa"/>
+              <w:right w:w="100" w:type="dxa"/>
             </w:tcMar>
           </w:tcPr>
           <w:p>
@@ -1188,7 +1262,7 @@
             <w:r>
               <w:rPr>
                 <w:b/>
-                <w:sz w:val="18"/>
+                <w:sz w:val="17"/>
               </w:rPr>
               <w:t>SUPPORT ENGINEER</w:t>
               <w:br/>
@@ -1198,13 +1272,13 @@
         </w:tc>
         <w:tc>
           <w:tcPr>
-            <w:tcW w:type="dxa" w:w="2257"/>
+            <w:tcW w:type="dxa" w:w="2329"/>
             <w:shd w:fill="F1F5F9"/>
             <w:tcMar>
-              <w:top w:w="100" w:type="dxa"/>
-              <w:bottom w:w="100" w:type="dxa"/>
-              <w:left w:w="120" w:type="dxa"/>
-              <w:right w:w="120" w:type="dxa"/>
+              <w:top w:w="80" w:type="dxa"/>
+              <w:bottom w:w="80" w:type="dxa"/>
+              <w:left w:w="100" w:type="dxa"/>
+              <w:right w:w="100" w:type="dxa"/>
             </w:tcMar>
           </w:tcPr>
           <w:p>
@@ -1214,7 +1288,7 @@
             <w:r>
               <w:rPr>
                 <w:b/>
-                <w:sz w:val="18"/>
+                <w:sz w:val="17"/>
               </w:rPr>
               <w:t>PORTAL KLIEN</w:t>
               <w:br/>
@@ -1226,18 +1300,18 @@
       <w:tr>
         <w:tc>
           <w:tcPr>
-            <w:tcW w:type="dxa" w:w="2257"/>
+            <w:tcW w:type="dxa" w:w="2329"/>
             <w:tcMar>
-              <w:top w:w="70" w:type="dxa"/>
-              <w:bottom w:w="70" w:type="dxa"/>
-              <w:left w:w="100" w:type="dxa"/>
-              <w:right w:w="100" w:type="dxa"/>
+              <w:top w:w="55" w:type="dxa"/>
+              <w:bottom w:w="55" w:type="dxa"/>
+              <w:left w:w="90" w:type="dxa"/>
+              <w:right w:w="90" w:type="dxa"/>
             </w:tcMar>
           </w:tcPr>
           <w:p>
             <w:r>
               <w:rPr>
-                <w:sz w:val="18"/>
+                <w:sz w:val="17"/>
               </w:rPr>
               <w:t>Monitoring Dashboard &amp; Antrean Global Tiket</w:t>
             </w:r>
@@ -1245,12 +1319,12 @@
         </w:tc>
         <w:tc>
           <w:tcPr>
-            <w:tcW w:type="dxa" w:w="2257"/>
+            <w:tcW w:type="dxa" w:w="2329"/>
             <w:tcMar>
-              <w:top w:w="70" w:type="dxa"/>
-              <w:bottom w:w="70" w:type="dxa"/>
-              <w:left w:w="100" w:type="dxa"/>
-              <w:right w:w="100" w:type="dxa"/>
+              <w:top w:w="55" w:type="dxa"/>
+              <w:bottom w:w="55" w:type="dxa"/>
+              <w:left w:w="90" w:type="dxa"/>
+              <w:right w:w="90" w:type="dxa"/>
             </w:tcMar>
           </w:tcPr>
           <w:p>
@@ -1260,7 +1334,7 @@
             <w:r>
               <w:rPr>
                 <w:b/>
-                <w:sz w:val="18"/>
+                <w:sz w:val="17"/>
               </w:rPr>
               <w:t>Akses Penuh</w:t>
             </w:r>
@@ -1268,12 +1342,12 @@
         </w:tc>
         <w:tc>
           <w:tcPr>
-            <w:tcW w:type="dxa" w:w="2257"/>
+            <w:tcW w:type="dxa" w:w="2329"/>
             <w:tcMar>
-              <w:top w:w="70" w:type="dxa"/>
-              <w:bottom w:w="70" w:type="dxa"/>
-              <w:left w:w="100" w:type="dxa"/>
-              <w:right w:w="100" w:type="dxa"/>
+              <w:top w:w="55" w:type="dxa"/>
+              <w:bottom w:w="55" w:type="dxa"/>
+              <w:left w:w="90" w:type="dxa"/>
+              <w:right w:w="90" w:type="dxa"/>
             </w:tcMar>
           </w:tcPr>
           <w:p>
@@ -1282,7 +1356,7 @@
             </w:pPr>
             <w:r>
               <w:rPr>
-                <w:sz w:val="18"/>
+                <w:sz w:val="17"/>
               </w:rPr>
               <w:t>Tiket Ditugaskan</w:t>
             </w:r>
@@ -1290,12 +1364,12 @@
         </w:tc>
         <w:tc>
           <w:tcPr>
-            <w:tcW w:type="dxa" w:w="2257"/>
+            <w:tcW w:type="dxa" w:w="2329"/>
             <w:tcMar>
-              <w:top w:w="70" w:type="dxa"/>
-              <w:bottom w:w="70" w:type="dxa"/>
-              <w:left w:w="100" w:type="dxa"/>
-              <w:right w:w="100" w:type="dxa"/>
+              <w:top w:w="55" w:type="dxa"/>
+              <w:bottom w:w="55" w:type="dxa"/>
+              <w:left w:w="90" w:type="dxa"/>
+              <w:right w:w="90" w:type="dxa"/>
             </w:tcMar>
           </w:tcPr>
           <w:p>
@@ -1304,7 +1378,7 @@
             </w:pPr>
             <w:r>
               <w:rPr>
-                <w:sz w:val="18"/>
+                <w:sz w:val="17"/>
               </w:rPr>
               <w:t>Ditolak</w:t>
             </w:r>
@@ -1314,19 +1388,19 @@
       <w:tr>
         <w:tc>
           <w:tcPr>
-            <w:tcW w:type="dxa" w:w="2257"/>
+            <w:tcW w:type="dxa" w:w="2329"/>
             <w:shd w:fill="F8FAFC"/>
             <w:tcMar>
-              <w:top w:w="70" w:type="dxa"/>
-              <w:bottom w:w="70" w:type="dxa"/>
-              <w:left w:w="100" w:type="dxa"/>
-              <w:right w:w="100" w:type="dxa"/>
+              <w:top w:w="55" w:type="dxa"/>
+              <w:bottom w:w="55" w:type="dxa"/>
+              <w:left w:w="90" w:type="dxa"/>
+              <w:right w:w="90" w:type="dxa"/>
             </w:tcMar>
           </w:tcPr>
           <w:p>
             <w:r>
               <w:rPr>
-                <w:sz w:val="18"/>
+                <w:sz w:val="17"/>
               </w:rPr>
               <w:t>Penerbitan Tiket Baru &amp; Pengisian Data Awal</w:t>
             </w:r>
@@ -1334,13 +1408,13 @@
         </w:tc>
         <w:tc>
           <w:tcPr>
-            <w:tcW w:type="dxa" w:w="2257"/>
+            <w:tcW w:type="dxa" w:w="2329"/>
             <w:shd w:fill="F8FAFC"/>
             <w:tcMar>
-              <w:top w:w="70" w:type="dxa"/>
-              <w:bottom w:w="70" w:type="dxa"/>
-              <w:left w:w="100" w:type="dxa"/>
-              <w:right w:w="100" w:type="dxa"/>
+              <w:top w:w="55" w:type="dxa"/>
+              <w:bottom w:w="55" w:type="dxa"/>
+              <w:left w:w="90" w:type="dxa"/>
+              <w:right w:w="90" w:type="dxa"/>
             </w:tcMar>
           </w:tcPr>
           <w:p>
@@ -1350,7 +1424,7 @@
             <w:r>
               <w:rPr>
                 <w:b/>
-                <w:sz w:val="18"/>
+                <w:sz w:val="17"/>
               </w:rPr>
               <w:t>Akses Penuh</w:t>
             </w:r>
@@ -1358,13 +1432,13 @@
         </w:tc>
         <w:tc>
           <w:tcPr>
-            <w:tcW w:type="dxa" w:w="2257"/>
+            <w:tcW w:type="dxa" w:w="2329"/>
             <w:shd w:fill="F8FAFC"/>
             <w:tcMar>
-              <w:top w:w="70" w:type="dxa"/>
-              <w:bottom w:w="70" w:type="dxa"/>
-              <w:left w:w="100" w:type="dxa"/>
-              <w:right w:w="100" w:type="dxa"/>
+              <w:top w:w="55" w:type="dxa"/>
+              <w:bottom w:w="55" w:type="dxa"/>
+              <w:left w:w="90" w:type="dxa"/>
+              <w:right w:w="90" w:type="dxa"/>
             </w:tcMar>
           </w:tcPr>
           <w:p>
@@ -1373,7 +1447,7 @@
             </w:pPr>
             <w:r>
               <w:rPr>
-                <w:sz w:val="18"/>
+                <w:sz w:val="17"/>
               </w:rPr>
               <w:t>Input Lapangan</w:t>
             </w:r>
@@ -1381,13 +1455,13 @@
         </w:tc>
         <w:tc>
           <w:tcPr>
-            <w:tcW w:type="dxa" w:w="2257"/>
+            <w:tcW w:type="dxa" w:w="2329"/>
             <w:shd w:fill="F8FAFC"/>
             <w:tcMar>
-              <w:top w:w="70" w:type="dxa"/>
-              <w:bottom w:w="70" w:type="dxa"/>
-              <w:left w:w="100" w:type="dxa"/>
-              <w:right w:w="100" w:type="dxa"/>
+              <w:top w:w="55" w:type="dxa"/>
+              <w:bottom w:w="55" w:type="dxa"/>
+              <w:left w:w="90" w:type="dxa"/>
+              <w:right w:w="90" w:type="dxa"/>
             </w:tcMar>
           </w:tcPr>
           <w:p>
@@ -1396,7 +1470,7 @@
             </w:pPr>
             <w:r>
               <w:rPr>
-                <w:sz w:val="18"/>
+                <w:sz w:val="17"/>
               </w:rPr>
               <w:t>Ditolak</w:t>
             </w:r>
@@ -1406,18 +1480,18 @@
       <w:tr>
         <w:tc>
           <w:tcPr>
-            <w:tcW w:type="dxa" w:w="2257"/>
+            <w:tcW w:type="dxa" w:w="2329"/>
             <w:tcMar>
-              <w:top w:w="70" w:type="dxa"/>
-              <w:bottom w:w="70" w:type="dxa"/>
-              <w:left w:w="100" w:type="dxa"/>
-              <w:right w:w="100" w:type="dxa"/>
+              <w:top w:w="55" w:type="dxa"/>
+              <w:bottom w:w="55" w:type="dxa"/>
+              <w:left w:w="90" w:type="dxa"/>
+              <w:right w:w="90" w:type="dxa"/>
             </w:tcMar>
           </w:tcPr>
           <w:p>
             <w:r>
               <w:rPr>
-                <w:sz w:val="18"/>
+                <w:sz w:val="17"/>
               </w:rPr>
               <w:t>Penugasan &amp; Pergantian Teknisi Penanggung Jawab</w:t>
             </w:r>
@@ -1425,12 +1499,12 @@
         </w:tc>
         <w:tc>
           <w:tcPr>
-            <w:tcW w:type="dxa" w:w="2257"/>
+            <w:tcW w:type="dxa" w:w="2329"/>
             <w:tcMar>
-              <w:top w:w="70" w:type="dxa"/>
-              <w:bottom w:w="70" w:type="dxa"/>
-              <w:left w:w="100" w:type="dxa"/>
-              <w:right w:w="100" w:type="dxa"/>
+              <w:top w:w="55" w:type="dxa"/>
+              <w:bottom w:w="55" w:type="dxa"/>
+              <w:left w:w="90" w:type="dxa"/>
+              <w:right w:w="90" w:type="dxa"/>
             </w:tcMar>
           </w:tcPr>
           <w:p>
@@ -1440,7 +1514,7 @@
             <w:r>
               <w:rPr>
                 <w:b/>
-                <w:sz w:val="18"/>
+                <w:sz w:val="17"/>
               </w:rPr>
               <w:t>Kontrol Penuh</w:t>
             </w:r>
@@ -1448,12 +1522,12 @@
         </w:tc>
         <w:tc>
           <w:tcPr>
-            <w:tcW w:type="dxa" w:w="2257"/>
+            <w:tcW w:type="dxa" w:w="2329"/>
             <w:tcMar>
-              <w:top w:w="70" w:type="dxa"/>
-              <w:bottom w:w="70" w:type="dxa"/>
-              <w:left w:w="100" w:type="dxa"/>
-              <w:right w:w="100" w:type="dxa"/>
+              <w:top w:w="55" w:type="dxa"/>
+              <w:bottom w:w="55" w:type="dxa"/>
+              <w:left w:w="90" w:type="dxa"/>
+              <w:right w:w="90" w:type="dxa"/>
             </w:tcMar>
           </w:tcPr>
           <w:p>
@@ -1462,7 +1536,7 @@
             </w:pPr>
             <w:r>
               <w:rPr>
-                <w:sz w:val="18"/>
+                <w:sz w:val="17"/>
               </w:rPr>
               <w:t>Hanya Baca</w:t>
             </w:r>
@@ -1470,12 +1544,12 @@
         </w:tc>
         <w:tc>
           <w:tcPr>
-            <w:tcW w:type="dxa" w:w="2257"/>
+            <w:tcW w:type="dxa" w:w="2329"/>
             <w:tcMar>
-              <w:top w:w="70" w:type="dxa"/>
-              <w:bottom w:w="70" w:type="dxa"/>
-              <w:left w:w="100" w:type="dxa"/>
-              <w:right w:w="100" w:type="dxa"/>
+              <w:top w:w="55" w:type="dxa"/>
+              <w:bottom w:w="55" w:type="dxa"/>
+              <w:left w:w="90" w:type="dxa"/>
+              <w:right w:w="90" w:type="dxa"/>
             </w:tcMar>
           </w:tcPr>
           <w:p>
@@ -1484,7 +1558,7 @@
             </w:pPr>
             <w:r>
               <w:rPr>
-                <w:sz w:val="18"/>
+                <w:sz w:val="17"/>
               </w:rPr>
               <w:t>Ditolak</w:t>
             </w:r>
@@ -1494,19 +1568,19 @@
       <w:tr>
         <w:tc>
           <w:tcPr>
-            <w:tcW w:type="dxa" w:w="2257"/>
+            <w:tcW w:type="dxa" w:w="2329"/>
             <w:shd w:fill="F8FAFC"/>
             <w:tcMar>
-              <w:top w:w="70" w:type="dxa"/>
-              <w:bottom w:w="70" w:type="dxa"/>
-              <w:left w:w="100" w:type="dxa"/>
-              <w:right w:w="100" w:type="dxa"/>
+              <w:top w:w="55" w:type="dxa"/>
+              <w:bottom w:w="55" w:type="dxa"/>
+              <w:left w:w="90" w:type="dxa"/>
+              <w:right w:w="90" w:type="dxa"/>
             </w:tcMar>
           </w:tcPr>
           <w:p>
             <w:r>
               <w:rPr>
-                <w:sz w:val="18"/>
+                <w:sz w:val="17"/>
               </w:rPr>
               <w:t>Penyalinan Tautan Pelacakan Klien (Token URL)</w:t>
             </w:r>
@@ -1514,13 +1588,13 @@
         </w:tc>
         <w:tc>
           <w:tcPr>
-            <w:tcW w:type="dxa" w:w="2257"/>
+            <w:tcW w:type="dxa" w:w="2329"/>
             <w:shd w:fill="F8FAFC"/>
             <w:tcMar>
-              <w:top w:w="70" w:type="dxa"/>
-              <w:bottom w:w="70" w:type="dxa"/>
-              <w:left w:w="100" w:type="dxa"/>
-              <w:right w:w="100" w:type="dxa"/>
+              <w:top w:w="55" w:type="dxa"/>
+              <w:bottom w:w="55" w:type="dxa"/>
+              <w:left w:w="90" w:type="dxa"/>
+              <w:right w:w="90" w:type="dxa"/>
             </w:tcMar>
           </w:tcPr>
           <w:p>
@@ -1530,7 +1604,7 @@
             <w:r>
               <w:rPr>
                 <w:b/>
-                <w:sz w:val="18"/>
+                <w:sz w:val="17"/>
               </w:rPr>
               <w:t>Akses Khusus</w:t>
             </w:r>
@@ -1538,13 +1612,13 @@
         </w:tc>
         <w:tc>
           <w:tcPr>
-            <w:tcW w:type="dxa" w:w="2257"/>
+            <w:tcW w:type="dxa" w:w="2329"/>
             <w:shd w:fill="F8FAFC"/>
             <w:tcMar>
-              <w:top w:w="70" w:type="dxa"/>
-              <w:bottom w:w="70" w:type="dxa"/>
-              <w:left w:w="100" w:type="dxa"/>
-              <w:right w:w="100" w:type="dxa"/>
+              <w:top w:w="55" w:type="dxa"/>
+              <w:bottom w:w="55" w:type="dxa"/>
+              <w:left w:w="90" w:type="dxa"/>
+              <w:right w:w="90" w:type="dxa"/>
             </w:tcMar>
           </w:tcPr>
           <w:p>
@@ -1553,7 +1627,7 @@
             </w:pPr>
             <w:r>
               <w:rPr>
-                <w:sz w:val="18"/>
+                <w:sz w:val="17"/>
               </w:rPr>
               <w:t>Disembunyikan</w:t>
             </w:r>
@@ -1561,13 +1635,13 @@
         </w:tc>
         <w:tc>
           <w:tcPr>
-            <w:tcW w:type="dxa" w:w="2257"/>
+            <w:tcW w:type="dxa" w:w="2329"/>
             <w:shd w:fill="F8FAFC"/>
             <w:tcMar>
-              <w:top w:w="70" w:type="dxa"/>
-              <w:bottom w:w="70" w:type="dxa"/>
-              <w:left w:w="100" w:type="dxa"/>
-              <w:right w:w="100" w:type="dxa"/>
+              <w:top w:w="55" w:type="dxa"/>
+              <w:bottom w:w="55" w:type="dxa"/>
+              <w:left w:w="90" w:type="dxa"/>
+              <w:right w:w="90" w:type="dxa"/>
             </w:tcMar>
           </w:tcPr>
           <w:p>
@@ -1576,7 +1650,7 @@
             </w:pPr>
             <w:r>
               <w:rPr>
-                <w:sz w:val="18"/>
+                <w:sz w:val="17"/>
               </w:rPr>
               <w:t>Ditolak</w:t>
             </w:r>
@@ -1586,18 +1660,18 @@
       <w:tr>
         <w:tc>
           <w:tcPr>
-            <w:tcW w:type="dxa" w:w="2257"/>
+            <w:tcW w:type="dxa" w:w="2329"/>
             <w:tcMar>
-              <w:top w:w="70" w:type="dxa"/>
-              <w:bottom w:w="70" w:type="dxa"/>
-              <w:left w:w="100" w:type="dxa"/>
-              <w:right w:w="100" w:type="dxa"/>
+              <w:top w:w="55" w:type="dxa"/>
+              <w:bottom w:w="55" w:type="dxa"/>
+              <w:left w:w="90" w:type="dxa"/>
+              <w:right w:w="90" w:type="dxa"/>
             </w:tcMar>
           </w:tcPr>
           <w:p>
             <w:r>
               <w:rPr>
-                <w:sz w:val="18"/>
+                <w:sz w:val="17"/>
               </w:rPr>
               <w:t>Pratinjau &amp; Pengiriman Surel Notifikasi Manual</w:t>
             </w:r>
@@ -1605,12 +1679,12 @@
         </w:tc>
         <w:tc>
           <w:tcPr>
-            <w:tcW w:type="dxa" w:w="2257"/>
+            <w:tcW w:type="dxa" w:w="2329"/>
             <w:tcMar>
-              <w:top w:w="70" w:type="dxa"/>
-              <w:bottom w:w="70" w:type="dxa"/>
-              <w:left w:w="100" w:type="dxa"/>
-              <w:right w:w="100" w:type="dxa"/>
+              <w:top w:w="55" w:type="dxa"/>
+              <w:bottom w:w="55" w:type="dxa"/>
+              <w:left w:w="90" w:type="dxa"/>
+              <w:right w:w="90" w:type="dxa"/>
             </w:tcMar>
           </w:tcPr>
           <w:p>
@@ -1620,7 +1694,7 @@
             <w:r>
               <w:rPr>
                 <w:b/>
-                <w:sz w:val="18"/>
+                <w:sz w:val="17"/>
               </w:rPr>
               <w:t>Akses Khusus</w:t>
             </w:r>
@@ -1628,12 +1702,12 @@
         </w:tc>
         <w:tc>
           <w:tcPr>
-            <w:tcW w:type="dxa" w:w="2257"/>
+            <w:tcW w:type="dxa" w:w="2329"/>
             <w:tcMar>
-              <w:top w:w="70" w:type="dxa"/>
-              <w:bottom w:w="70" w:type="dxa"/>
-              <w:left w:w="100" w:type="dxa"/>
-              <w:right w:w="100" w:type="dxa"/>
+              <w:top w:w="55" w:type="dxa"/>
+              <w:bottom w:w="55" w:type="dxa"/>
+              <w:left w:w="90" w:type="dxa"/>
+              <w:right w:w="90" w:type="dxa"/>
             </w:tcMar>
           </w:tcPr>
           <w:p>
@@ -1642,7 +1716,7 @@
             </w:pPr>
             <w:r>
               <w:rPr>
-                <w:sz w:val="18"/>
+                <w:sz w:val="17"/>
               </w:rPr>
               <w:t>Disembunyikan</w:t>
             </w:r>
@@ -1650,12 +1724,12 @@
         </w:tc>
         <w:tc>
           <w:tcPr>
-            <w:tcW w:type="dxa" w:w="2257"/>
+            <w:tcW w:type="dxa" w:w="2329"/>
             <w:tcMar>
-              <w:top w:w="70" w:type="dxa"/>
-              <w:bottom w:w="70" w:type="dxa"/>
-              <w:left w:w="100" w:type="dxa"/>
-              <w:right w:w="100" w:type="dxa"/>
+              <w:top w:w="55" w:type="dxa"/>
+              <w:bottom w:w="55" w:type="dxa"/>
+              <w:left w:w="90" w:type="dxa"/>
+              <w:right w:w="90" w:type="dxa"/>
             </w:tcMar>
           </w:tcPr>
           <w:p>
@@ -1664,7 +1738,7 @@
             </w:pPr>
             <w:r>
               <w:rPr>
-                <w:sz w:val="18"/>
+                <w:sz w:val="17"/>
               </w:rPr>
               <w:t>Ditolak</w:t>
             </w:r>
@@ -1674,19 +1748,19 @@
       <w:tr>
         <w:tc>
           <w:tcPr>
-            <w:tcW w:type="dxa" w:w="2257"/>
+            <w:tcW w:type="dxa" w:w="2329"/>
             <w:shd w:fill="F8FAFC"/>
             <w:tcMar>
-              <w:top w:w="70" w:type="dxa"/>
-              <w:bottom w:w="70" w:type="dxa"/>
-              <w:left w:w="100" w:type="dxa"/>
-              <w:right w:w="100" w:type="dxa"/>
+              <w:top w:w="55" w:type="dxa"/>
+              <w:bottom w:w="55" w:type="dxa"/>
+              <w:left w:w="90" w:type="dxa"/>
+              <w:right w:w="90" w:type="dxa"/>
             </w:tcMar>
           </w:tcPr>
           <w:p>
             <w:r>
               <w:rPr>
-                <w:sz w:val="18"/>
+                <w:sz w:val="17"/>
               </w:rPr>
               <w:t>Pencatatan Milestone &amp; Log Perintah Perbaikan</w:t>
             </w:r>
@@ -1694,13 +1768,13 @@
         </w:tc>
         <w:tc>
           <w:tcPr>
-            <w:tcW w:type="dxa" w:w="2257"/>
+            <w:tcW w:type="dxa" w:w="2329"/>
             <w:shd w:fill="F8FAFC"/>
             <w:tcMar>
-              <w:top w:w="70" w:type="dxa"/>
-              <w:bottom w:w="70" w:type="dxa"/>
-              <w:left w:w="100" w:type="dxa"/>
-              <w:right w:w="100" w:type="dxa"/>
+              <w:top w:w="55" w:type="dxa"/>
+              <w:bottom w:w="55" w:type="dxa"/>
+              <w:left w:w="90" w:type="dxa"/>
+              <w:right w:w="90" w:type="dxa"/>
             </w:tcMar>
           </w:tcPr>
           <w:p>
@@ -1709,7 +1783,7 @@
             </w:pPr>
             <w:r>
               <w:rPr>
-                <w:sz w:val="18"/>
+                <w:sz w:val="17"/>
               </w:rPr>
               <w:t>Bisa Menambah</w:t>
             </w:r>
@@ -1717,13 +1791,13 @@
         </w:tc>
         <w:tc>
           <w:tcPr>
-            <w:tcW w:type="dxa" w:w="2257"/>
+            <w:tcW w:type="dxa" w:w="2329"/>
             <w:shd w:fill="F8FAFC"/>
             <w:tcMar>
-              <w:top w:w="70" w:type="dxa"/>
-              <w:bottom w:w="70" w:type="dxa"/>
-              <w:left w:w="100" w:type="dxa"/>
-              <w:right w:w="100" w:type="dxa"/>
+              <w:top w:w="55" w:type="dxa"/>
+              <w:bottom w:w="55" w:type="dxa"/>
+              <w:left w:w="90" w:type="dxa"/>
+              <w:right w:w="90" w:type="dxa"/>
             </w:tcMar>
           </w:tcPr>
           <w:p>
@@ -1733,7 +1807,7 @@
             <w:r>
               <w:rPr>
                 <w:b/>
-                <w:sz w:val="18"/>
+                <w:sz w:val="17"/>
               </w:rPr>
               <w:t>Pelaksana Utama</w:t>
             </w:r>
@@ -1741,13 +1815,13 @@
         </w:tc>
         <w:tc>
           <w:tcPr>
-            <w:tcW w:type="dxa" w:w="2257"/>
+            <w:tcW w:type="dxa" w:w="2329"/>
             <w:shd w:fill="F8FAFC"/>
             <w:tcMar>
-              <w:top w:w="70" w:type="dxa"/>
-              <w:bottom w:w="70" w:type="dxa"/>
-              <w:left w:w="100" w:type="dxa"/>
-              <w:right w:w="100" w:type="dxa"/>
+              <w:top w:w="55" w:type="dxa"/>
+              <w:bottom w:w="55" w:type="dxa"/>
+              <w:left w:w="90" w:type="dxa"/>
+              <w:right w:w="90" w:type="dxa"/>
             </w:tcMar>
           </w:tcPr>
           <w:p>
@@ -1756,7 +1830,7 @@
             </w:pPr>
             <w:r>
               <w:rPr>
-                <w:sz w:val="18"/>
+                <w:sz w:val="17"/>
               </w:rPr>
               <w:t>Ditolak</w:t>
             </w:r>
@@ -1766,18 +1840,18 @@
       <w:tr>
         <w:tc>
           <w:tcPr>
-            <w:tcW w:type="dxa" w:w="2257"/>
+            <w:tcW w:type="dxa" w:w="2329"/>
             <w:tcMar>
-              <w:top w:w="70" w:type="dxa"/>
-              <w:bottom w:w="70" w:type="dxa"/>
-              <w:left w:w="100" w:type="dxa"/>
-              <w:right w:w="100" w:type="dxa"/>
+              <w:top w:w="55" w:type="dxa"/>
+              <w:bottom w:w="55" w:type="dxa"/>
+              <w:left w:w="90" w:type="dxa"/>
+              <w:right w:w="90" w:type="dxa"/>
             </w:tcMar>
           </w:tcPr>
           <w:p>
             <w:r>
               <w:rPr>
-                <w:sz w:val="18"/>
+                <w:sz w:val="17"/>
               </w:rPr>
               <w:t>Pengajuan &amp; Pencabutan Jeda SLA (Pause)</w:t>
             </w:r>
@@ -1785,12 +1859,12 @@
         </w:tc>
         <w:tc>
           <w:tcPr>
-            <w:tcW w:type="dxa" w:w="2257"/>
+            <w:tcW w:type="dxa" w:w="2329"/>
             <w:tcMar>
-              <w:top w:w="70" w:type="dxa"/>
-              <w:bottom w:w="70" w:type="dxa"/>
-              <w:left w:w="100" w:type="dxa"/>
-              <w:right w:w="100" w:type="dxa"/>
+              <w:top w:w="55" w:type="dxa"/>
+              <w:bottom w:w="55" w:type="dxa"/>
+              <w:left w:w="90" w:type="dxa"/>
+              <w:right w:w="90" w:type="dxa"/>
             </w:tcMar>
           </w:tcPr>
           <w:p>
@@ -1799,7 +1873,7 @@
             </w:pPr>
             <w:r>
               <w:rPr>
-                <w:sz w:val="18"/>
+                <w:sz w:val="17"/>
               </w:rPr>
               <w:t>Validasi Otoritas</w:t>
             </w:r>
@@ -1807,12 +1881,12 @@
         </w:tc>
         <w:tc>
           <w:tcPr>
-            <w:tcW w:type="dxa" w:w="2257"/>
+            <w:tcW w:type="dxa" w:w="2329"/>
             <w:tcMar>
-              <w:top w:w="70" w:type="dxa"/>
-              <w:bottom w:w="70" w:type="dxa"/>
-              <w:left w:w="100" w:type="dxa"/>
-              <w:right w:w="100" w:type="dxa"/>
+              <w:top w:w="55" w:type="dxa"/>
+              <w:bottom w:w="55" w:type="dxa"/>
+              <w:left w:w="90" w:type="dxa"/>
+              <w:right w:w="90" w:type="dxa"/>
             </w:tcMar>
           </w:tcPr>
           <w:p>
@@ -1822,7 +1896,7 @@
             <w:r>
               <w:rPr>
                 <w:b/>
-                <w:sz w:val="18"/>
+                <w:sz w:val="17"/>
               </w:rPr>
               <w:t>Pelaksana Utama</w:t>
             </w:r>
@@ -1830,12 +1904,12 @@
         </w:tc>
         <w:tc>
           <w:tcPr>
-            <w:tcW w:type="dxa" w:w="2257"/>
+            <w:tcW w:type="dxa" w:w="2329"/>
             <w:tcMar>
-              <w:top w:w="70" w:type="dxa"/>
-              <w:bottom w:w="70" w:type="dxa"/>
-              <w:left w:w="100" w:type="dxa"/>
-              <w:right w:w="100" w:type="dxa"/>
+              <w:top w:w="55" w:type="dxa"/>
+              <w:bottom w:w="55" w:type="dxa"/>
+              <w:left w:w="90" w:type="dxa"/>
+              <w:right w:w="90" w:type="dxa"/>
             </w:tcMar>
           </w:tcPr>
           <w:p>
@@ -1844,7 +1918,7 @@
             </w:pPr>
             <w:r>
               <w:rPr>
-                <w:sz w:val="18"/>
+                <w:sz w:val="17"/>
               </w:rPr>
               <w:t>Ditolak</w:t>
             </w:r>
@@ -1854,19 +1928,19 @@
       <w:tr>
         <w:tc>
           <w:tcPr>
-            <w:tcW w:type="dxa" w:w="2257"/>
+            <w:tcW w:type="dxa" w:w="2329"/>
             <w:shd w:fill="F8FAFC"/>
             <w:tcMar>
-              <w:top w:w="70" w:type="dxa"/>
-              <w:bottom w:w="70" w:type="dxa"/>
-              <w:left w:w="100" w:type="dxa"/>
-              <w:right w:w="100" w:type="dxa"/>
+              <w:top w:w="55" w:type="dxa"/>
+              <w:bottom w:w="55" w:type="dxa"/>
+              <w:left w:w="90" w:type="dxa"/>
+              <w:right w:w="90" w:type="dxa"/>
             </w:tcMar>
           </w:tcPr>
           <w:p>
             <w:r>
               <w:rPr>
-                <w:sz w:val="18"/>
+                <w:sz w:val="17"/>
               </w:rPr>
               <w:t>Penyelesaian Tiket &amp; Analisis Akar Masalah (RCA)</w:t>
             </w:r>
@@ -1874,13 +1948,13 @@
         </w:tc>
         <w:tc>
           <w:tcPr>
-            <w:tcW w:type="dxa" w:w="2257"/>
+            <w:tcW w:type="dxa" w:w="2329"/>
             <w:shd w:fill="F8FAFC"/>
             <w:tcMar>
-              <w:top w:w="70" w:type="dxa"/>
-              <w:bottom w:w="70" w:type="dxa"/>
-              <w:left w:w="100" w:type="dxa"/>
-              <w:right w:w="100" w:type="dxa"/>
+              <w:top w:w="55" w:type="dxa"/>
+              <w:bottom w:w="55" w:type="dxa"/>
+              <w:left w:w="90" w:type="dxa"/>
+              <w:right w:w="90" w:type="dxa"/>
             </w:tcMar>
           </w:tcPr>
           <w:p>
@@ -1889,7 +1963,7 @@
             </w:pPr>
             <w:r>
               <w:rPr>
-                <w:sz w:val="18"/>
+                <w:sz w:val="17"/>
               </w:rPr>
               <w:t>Verifikasi Akhir</w:t>
             </w:r>
@@ -1897,13 +1971,13 @@
         </w:tc>
         <w:tc>
           <w:tcPr>
-            <w:tcW w:type="dxa" w:w="2257"/>
+            <w:tcW w:type="dxa" w:w="2329"/>
             <w:shd w:fill="F8FAFC"/>
             <w:tcMar>
-              <w:top w:w="70" w:type="dxa"/>
-              <w:bottom w:w="70" w:type="dxa"/>
-              <w:left w:w="100" w:type="dxa"/>
-              <w:right w:w="100" w:type="dxa"/>
+              <w:top w:w="55" w:type="dxa"/>
+              <w:bottom w:w="55" w:type="dxa"/>
+              <w:left w:w="90" w:type="dxa"/>
+              <w:right w:w="90" w:type="dxa"/>
             </w:tcMar>
           </w:tcPr>
           <w:p>
@@ -1913,7 +1987,7 @@
             <w:r>
               <w:rPr>
                 <w:b/>
-                <w:sz w:val="18"/>
+                <w:sz w:val="17"/>
               </w:rPr>
               <w:t>Pelaksana Utama</w:t>
             </w:r>
@@ -1921,13 +1995,13 @@
         </w:tc>
         <w:tc>
           <w:tcPr>
-            <w:tcW w:type="dxa" w:w="2257"/>
+            <w:tcW w:type="dxa" w:w="2329"/>
             <w:shd w:fill="F8FAFC"/>
             <w:tcMar>
-              <w:top w:w="70" w:type="dxa"/>
-              <w:bottom w:w="70" w:type="dxa"/>
-              <w:left w:w="100" w:type="dxa"/>
-              <w:right w:w="100" w:type="dxa"/>
+              <w:top w:w="55" w:type="dxa"/>
+              <w:bottom w:w="55" w:type="dxa"/>
+              <w:left w:w="90" w:type="dxa"/>
+              <w:right w:w="90" w:type="dxa"/>
             </w:tcMar>
           </w:tcPr>
           <w:p>
@@ -1936,7 +2010,7 @@
             </w:pPr>
             <w:r>
               <w:rPr>
-                <w:sz w:val="18"/>
+                <w:sz w:val="17"/>
               </w:rPr>
               <w:t>Ditolak</w:t>
             </w:r>
@@ -1946,18 +2020,18 @@
       <w:tr>
         <w:tc>
           <w:tcPr>
-            <w:tcW w:type="dxa" w:w="2257"/>
+            <w:tcW w:type="dxa" w:w="2329"/>
             <w:tcMar>
-              <w:top w:w="70" w:type="dxa"/>
-              <w:bottom w:w="70" w:type="dxa"/>
-              <w:left w:w="100" w:type="dxa"/>
-              <w:right w:w="100" w:type="dxa"/>
+              <w:top w:w="55" w:type="dxa"/>
+              <w:bottom w:w="55" w:type="dxa"/>
+              <w:left w:w="90" w:type="dxa"/>
+              <w:right w:w="90" w:type="dxa"/>
             </w:tcMar>
           </w:tcPr>
           <w:p>
             <w:r>
               <w:rPr>
-                <w:sz w:val="18"/>
+                <w:sz w:val="17"/>
               </w:rPr>
               <w:t>Pengaturan Matriks SLA &amp; Data Klien</w:t>
             </w:r>
@@ -1965,12 +2039,12 @@
         </w:tc>
         <w:tc>
           <w:tcPr>
-            <w:tcW w:type="dxa" w:w="2257"/>
+            <w:tcW w:type="dxa" w:w="2329"/>
             <w:tcMar>
-              <w:top w:w="70" w:type="dxa"/>
-              <w:bottom w:w="70" w:type="dxa"/>
-              <w:left w:w="100" w:type="dxa"/>
-              <w:right w:w="100" w:type="dxa"/>
+              <w:top w:w="55" w:type="dxa"/>
+              <w:bottom w:w="55" w:type="dxa"/>
+              <w:left w:w="90" w:type="dxa"/>
+              <w:right w:w="90" w:type="dxa"/>
             </w:tcMar>
           </w:tcPr>
           <w:p>
@@ -1980,7 +2054,7 @@
             <w:r>
               <w:rPr>
                 <w:b/>
-                <w:sz w:val="18"/>
+                <w:sz w:val="17"/>
               </w:rPr>
               <w:t>Akses Penuh</w:t>
             </w:r>
@@ -1988,12 +2062,12 @@
         </w:tc>
         <w:tc>
           <w:tcPr>
-            <w:tcW w:type="dxa" w:w="2257"/>
+            <w:tcW w:type="dxa" w:w="2329"/>
             <w:tcMar>
-              <w:top w:w="70" w:type="dxa"/>
-              <w:bottom w:w="70" w:type="dxa"/>
-              <w:left w:w="100" w:type="dxa"/>
-              <w:right w:w="100" w:type="dxa"/>
+              <w:top w:w="55" w:type="dxa"/>
+              <w:bottom w:w="55" w:type="dxa"/>
+              <w:left w:w="90" w:type="dxa"/>
+              <w:right w:w="90" w:type="dxa"/>
             </w:tcMar>
           </w:tcPr>
           <w:p>
@@ -2002,7 +2076,7 @@
             </w:pPr>
             <w:r>
               <w:rPr>
-                <w:sz w:val="18"/>
+                <w:sz w:val="17"/>
               </w:rPr>
               <w:t>Ditolak</w:t>
             </w:r>
@@ -2010,12 +2084,12 @@
         </w:tc>
         <w:tc>
           <w:tcPr>
-            <w:tcW w:type="dxa" w:w="2257"/>
+            <w:tcW w:type="dxa" w:w="2329"/>
             <w:tcMar>
-              <w:top w:w="70" w:type="dxa"/>
-              <w:bottom w:w="70" w:type="dxa"/>
-              <w:left w:w="100" w:type="dxa"/>
-              <w:right w:w="100" w:type="dxa"/>
+              <w:top w:w="55" w:type="dxa"/>
+              <w:bottom w:w="55" w:type="dxa"/>
+              <w:left w:w="90" w:type="dxa"/>
+              <w:right w:w="90" w:type="dxa"/>
             </w:tcMar>
           </w:tcPr>
           <w:p>
@@ -2024,7 +2098,7 @@
             </w:pPr>
             <w:r>
               <w:rPr>
-                <w:sz w:val="18"/>
+                <w:sz w:val="17"/>
               </w:rPr>
               <w:t>Ditolak</w:t>
             </w:r>
@@ -2034,19 +2108,19 @@
       <w:tr>
         <w:tc>
           <w:tcPr>
-            <w:tcW w:type="dxa" w:w="2257"/>
+            <w:tcW w:type="dxa" w:w="2329"/>
             <w:shd w:fill="F8FAFC"/>
             <w:tcMar>
-              <w:top w:w="70" w:type="dxa"/>
-              <w:bottom w:w="70" w:type="dxa"/>
-              <w:left w:w="100" w:type="dxa"/>
-              <w:right w:w="100" w:type="dxa"/>
+              <w:top w:w="55" w:type="dxa"/>
+              <w:bottom w:w="55" w:type="dxa"/>
+              <w:left w:w="90" w:type="dxa"/>
+              <w:right w:w="90" w:type="dxa"/>
             </w:tcMar>
           </w:tcPr>
           <w:p>
             <w:r>
               <w:rPr>
-                <w:sz w:val="18"/>
+                <w:sz w:val="17"/>
               </w:rPr>
               <w:t>Laporan SLA &amp; Ekspor Berkas Laporan</w:t>
             </w:r>
@@ -2054,13 +2128,13 @@
         </w:tc>
         <w:tc>
           <w:tcPr>
-            <w:tcW w:type="dxa" w:w="2257"/>
+            <w:tcW w:type="dxa" w:w="2329"/>
             <w:shd w:fill="F8FAFC"/>
             <w:tcMar>
-              <w:top w:w="70" w:type="dxa"/>
-              <w:bottom w:w="70" w:type="dxa"/>
-              <w:left w:w="100" w:type="dxa"/>
-              <w:right w:w="100" w:type="dxa"/>
+              <w:top w:w="55" w:type="dxa"/>
+              <w:bottom w:w="55" w:type="dxa"/>
+              <w:left w:w="90" w:type="dxa"/>
+              <w:right w:w="90" w:type="dxa"/>
             </w:tcMar>
           </w:tcPr>
           <w:p>
@@ -2070,7 +2144,7 @@
             <w:r>
               <w:rPr>
                 <w:b/>
-                <w:sz w:val="18"/>
+                <w:sz w:val="17"/>
               </w:rPr>
               <w:t>Akses Penuh</w:t>
             </w:r>
@@ -2078,13 +2152,13 @@
         </w:tc>
         <w:tc>
           <w:tcPr>
-            <w:tcW w:type="dxa" w:w="2257"/>
+            <w:tcW w:type="dxa" w:w="2329"/>
             <w:shd w:fill="F8FAFC"/>
             <w:tcMar>
-              <w:top w:w="70" w:type="dxa"/>
-              <w:bottom w:w="70" w:type="dxa"/>
-              <w:left w:w="100" w:type="dxa"/>
-              <w:right w:w="100" w:type="dxa"/>
+              <w:top w:w="55" w:type="dxa"/>
+              <w:bottom w:w="55" w:type="dxa"/>
+              <w:left w:w="90" w:type="dxa"/>
+              <w:right w:w="90" w:type="dxa"/>
             </w:tcMar>
           </w:tcPr>
           <w:p>
@@ -2093,7 +2167,7 @@
             </w:pPr>
             <w:r>
               <w:rPr>
-                <w:sz w:val="18"/>
+                <w:sz w:val="17"/>
               </w:rPr>
               <w:t>Ditolak</w:t>
             </w:r>
@@ -2101,13 +2175,13 @@
         </w:tc>
         <w:tc>
           <w:tcPr>
-            <w:tcW w:type="dxa" w:w="2257"/>
+            <w:tcW w:type="dxa" w:w="2329"/>
             <w:shd w:fill="F8FAFC"/>
             <w:tcMar>
-              <w:top w:w="70" w:type="dxa"/>
-              <w:bottom w:w="70" w:type="dxa"/>
-              <w:left w:w="100" w:type="dxa"/>
-              <w:right w:w="100" w:type="dxa"/>
+              <w:top w:w="55" w:type="dxa"/>
+              <w:bottom w:w="55" w:type="dxa"/>
+              <w:left w:w="90" w:type="dxa"/>
+              <w:right w:w="90" w:type="dxa"/>
             </w:tcMar>
           </w:tcPr>
           <w:p>
@@ -2116,7 +2190,7 @@
             </w:pPr>
             <w:r>
               <w:rPr>
-                <w:sz w:val="18"/>
+                <w:sz w:val="17"/>
               </w:rPr>
               <w:t>Ditolak</w:t>
             </w:r>
@@ -2126,18 +2200,18 @@
       <w:tr>
         <w:tc>
           <w:tcPr>
-            <w:tcW w:type="dxa" w:w="2257"/>
+            <w:tcW w:type="dxa" w:w="2329"/>
             <w:tcMar>
-              <w:top w:w="70" w:type="dxa"/>
-              <w:bottom w:w="70" w:type="dxa"/>
-              <w:left w:w="100" w:type="dxa"/>
-              <w:right w:w="100" w:type="dxa"/>
+              <w:top w:w="55" w:type="dxa"/>
+              <w:bottom w:w="55" w:type="dxa"/>
+              <w:left w:w="90" w:type="dxa"/>
+              <w:right w:w="90" w:type="dxa"/>
             </w:tcMar>
           </w:tcPr>
           <w:p>
             <w:r>
               <w:rPr>
-                <w:sz w:val="18"/>
+                <w:sz w:val="17"/>
               </w:rPr>
               <w:t>Basis Pengetahuan (Knowledge Base)</w:t>
             </w:r>
@@ -2145,12 +2219,12 @@
         </w:tc>
         <w:tc>
           <w:tcPr>
-            <w:tcW w:type="dxa" w:w="2257"/>
+            <w:tcW w:type="dxa" w:w="2329"/>
             <w:tcMar>
-              <w:top w:w="70" w:type="dxa"/>
-              <w:bottom w:w="70" w:type="dxa"/>
-              <w:left w:w="100" w:type="dxa"/>
-              <w:right w:w="100" w:type="dxa"/>
+              <w:top w:w="55" w:type="dxa"/>
+              <w:bottom w:w="55" w:type="dxa"/>
+              <w:left w:w="90" w:type="dxa"/>
+              <w:right w:w="90" w:type="dxa"/>
             </w:tcMar>
           </w:tcPr>
           <w:p>
@@ -2160,7 +2234,7 @@
             <w:r>
               <w:rPr>
                 <w:b/>
-                <w:sz w:val="18"/>
+                <w:sz w:val="17"/>
               </w:rPr>
               <w:t>Persetujuan SOP</w:t>
             </w:r>
@@ -2168,12 +2242,12 @@
         </w:tc>
         <w:tc>
           <w:tcPr>
-            <w:tcW w:type="dxa" w:w="2257"/>
+            <w:tcW w:type="dxa" w:w="2329"/>
             <w:tcMar>
-              <w:top w:w="70" w:type="dxa"/>
-              <w:bottom w:w="70" w:type="dxa"/>
-              <w:left w:w="100" w:type="dxa"/>
-              <w:right w:w="100" w:type="dxa"/>
+              <w:top w:w="55" w:type="dxa"/>
+              <w:bottom w:w="55" w:type="dxa"/>
+              <w:left w:w="90" w:type="dxa"/>
+              <w:right w:w="90" w:type="dxa"/>
             </w:tcMar>
           </w:tcPr>
           <w:p>
@@ -2182,7 +2256,7 @@
             </w:pPr>
             <w:r>
               <w:rPr>
-                <w:sz w:val="18"/>
+                <w:sz w:val="17"/>
               </w:rPr>
               <w:t>Ajukan &amp; Membaca</w:t>
             </w:r>
@@ -2190,12 +2264,12 @@
         </w:tc>
         <w:tc>
           <w:tcPr>
-            <w:tcW w:type="dxa" w:w="2257"/>
+            <w:tcW w:type="dxa" w:w="2329"/>
             <w:tcMar>
-              <w:top w:w="70" w:type="dxa"/>
-              <w:bottom w:w="70" w:type="dxa"/>
-              <w:left w:w="100" w:type="dxa"/>
-              <w:right w:w="100" w:type="dxa"/>
+              <w:top w:w="55" w:type="dxa"/>
+              <w:bottom w:w="55" w:type="dxa"/>
+              <w:left w:w="90" w:type="dxa"/>
+              <w:right w:w="90" w:type="dxa"/>
             </w:tcMar>
           </w:tcPr>
           <w:p>
@@ -2204,7 +2278,7 @@
             </w:pPr>
             <w:r>
               <w:rPr>
-                <w:sz w:val="18"/>
+                <w:sz w:val="17"/>
               </w:rPr>
               <w:t>Hanya Baca</w:t>
             </w:r>
@@ -2214,19 +2288,19 @@
     </w:tbl>
     <w:p>
       <w:pPr>
-        <w:spacing w:after="200"/>
+        <w:spacing w:after="160"/>
       </w:pPr>
     </w:p>
     <w:p>
       <w:pPr>
-        <w:spacing w:before="280" w:after="80"/>
+        <w:spacing w:before="200" w:after="80"/>
       </w:pPr>
       <w:r>
         <w:rPr>
           <w:b/>
-          <w:sz w:val="24"/>
+          <w:sz w:val="23"/>
         </w:rPr>
-        <w:t>3. ALUR PROSES PENANGANAN TIKET (FLOWCHART)</w:t>
+        <w:t>3. DIAGRAM ALUR PROSES PENANGANAN TIKET (FLOWCHART)</w:t>
       </w:r>
     </w:p>
     <w:p>
@@ -2234,7 +2308,61 @@
         <w:spacing w:after="120"/>
       </w:pPr>
       <w:r>
-        <w:t>Setiap insiden ditangani melalui 6 tahapan kerja berurutan dengan alur kendali logika sebagai berikut:</w:t>
+        <w:t>Siklus hidup setiap insiden dimodelkan dalam bentuk diagram alur proses terstruktur dari pelaporan awal hingga tiket ditutup:</w:t>
+      </w:r>
+    </w:p>
+    <w:p>
+      <w:pPr>
+        <w:spacing w:before="80" w:after="80"/>
+        <w:jc w:val="center"/>
+      </w:pPr>
+      <w:r>
+        <w:drawing>
+          <wp:inline xmlns:a="http://schemas.openxmlformats.org/drawingml/2006/main" xmlns:pic="http://schemas.openxmlformats.org/drawingml/2006/picture">
+            <wp:extent cx="5852160" cy="2660073"/>
+            <wp:docPr id="2" name="Picture 2"/>
+            <wp:cNvGraphicFramePr>
+              <a:graphicFrameLocks noChangeAspect="1"/>
+            </wp:cNvGraphicFramePr>
+            <a:graphic>
+              <a:graphicData uri="http://schemas.openxmlformats.org/drawingml/2006/picture">
+                <pic:pic>
+                  <pic:nvPicPr>
+                    <pic:cNvPr id="0" name="diagram_flowchart.png"/>
+                    <pic:cNvPicPr/>
+                  </pic:nvPicPr>
+                  <pic:blipFill>
+                    <a:blip r:embed="rId10"/>
+                    <a:stretch>
+                      <a:fillRect/>
+                    </a:stretch>
+                  </pic:blipFill>
+                  <pic:spPr>
+                    <a:xfrm>
+                      <a:off x="0" y="0"/>
+                      <a:ext cx="5852160" cy="2660073"/>
+                    </a:xfrm>
+                    <a:prstGeom prst="rect"/>
+                  </pic:spPr>
+                </pic:pic>
+              </a:graphicData>
+            </a:graphic>
+          </wp:inline>
+        </w:drawing>
+      </w:r>
+    </w:p>
+    <w:p>
+      <w:pPr>
+        <w:spacing w:after="160"/>
+        <w:jc w:val="center"/>
+      </w:pPr>
+      <w:r>
+        <w:rPr>
+          <w:i/>
+          <w:color w:val="475569"/>
+          <w:sz w:val="17"/>
+        </w:rPr>
+        <w:t>Gambar 1.2 Diagram Alur Logika Penanganan Tiket (Incident Lifecycle Flowchart)</w:t>
       </w:r>
     </w:p>
     <w:p>
@@ -2245,13 +2373,13 @@
       <w:r>
         <w:rPr>
           <w:b/>
-          <w:sz w:val="19"/>
+          <w:sz w:val="18"/>
         </w:rPr>
-        <w:t xml:space="preserve">• Tahap 1: Laporan Masuk &amp; Pencatatan Tiket: </w:t>
+        <w:t xml:space="preserve">• 1. Laporan Masuk &amp; Pencatatan Tiket: </w:t>
       </w:r>
       <w:r>
         <w:rPr>
-          <w:sz w:val="19"/>
+          <w:sz w:val="18"/>
         </w:rPr>
         <w:t>Petugas Helpdesk/CPIG mencatat tiket baru ke sistem Express.js. Sistem mengunci target respon dan resolusi SLA secara otomatis dari tabel master SLA sesuai kontrak pelanggan. Email konfirmasi dan tautan token dibuat dan dikirimkan via SMTP.</w:t>
       </w:r>
@@ -2264,13 +2392,13 @@
       <w:r>
         <w:rPr>
           <w:b/>
-          <w:sz w:val="19"/>
+          <w:sz w:val="18"/>
         </w:rPr>
-        <w:t xml:space="preserve">• Tahap 2: Respon Awal Teknisi (First Touch SLA): </w:t>
+        <w:t xml:space="preserve">• 2. Respon Awal Teknisi (First Touch SLA): </w:t>
       </w:r>
       <w:r>
         <w:rPr>
-          <w:sz w:val="19"/>
+          <w:sz w:val="18"/>
         </w:rPr>
         <w:t>Teknisi mengubah status tiket menjadi IN_PROGRESS. Sistem menghentikan timer perhitungan Response SLA dan mencatat waktu respon pertama secara permanen di database.</w:t>
       </w:r>
@@ -2283,13 +2411,13 @@
       <w:r>
         <w:rPr>
           <w:b/>
-          <w:sz w:val="19"/>
+          <w:sz w:val="18"/>
         </w:rPr>
-        <w:t xml:space="preserve">• Tahap 3: Investigasi Diagnostik &amp; Milestone: </w:t>
+        <w:t xml:space="preserve">• 3. Investigasi Diagnostik &amp; Milestone: </w:t>
       </w:r>
       <w:r>
         <w:rPr>
-          <w:sz w:val="19"/>
+          <w:sz w:val="18"/>
         </w:rPr>
         <w:t>Teknisi melakukan penelusuran masalah dan mencatatkan setiap tindakan teknis, hasil observasi, serta riwayat eksekusi perintah terminal ke dalam tabel ticket_milestones.</w:t>
       </w:r>
@@ -2302,13 +2430,13 @@
       <w:r>
         <w:rPr>
           <w:b/>
-          <w:sz w:val="19"/>
+          <w:sz w:val="18"/>
         </w:rPr>
-        <w:t xml:space="preserve">• Tahap 4: Penanganan Jeda Waktu SLA (Clock Pause): </w:t>
+        <w:t xml:space="preserve">• 4. Penanganan Jeda Waktu SLA (Clock Pause): </w:t>
       </w:r>
       <w:r>
         <w:rPr>
-          <w:sz w:val="19"/>
+          <w:sz w:val="18"/>
         </w:rPr>
         <w:t>Jika perbaikan terhenti akibat menunggu komponen suku cadang dari vendor principal atau menunggu jendela pemeliharaan klien, teknisi mengaktifkan status Pause. Timer resolusi SLA dibekukan sementara sehingga sisa waktu SLA tidak terpotong.</w:t>
       </w:r>
@@ -2321,13 +2449,13 @@
       <w:r>
         <w:rPr>
           <w:b/>
-          <w:sz w:val="19"/>
+          <w:sz w:val="18"/>
         </w:rPr>
-        <w:t xml:space="preserve">• Tahap 5: Pemulihan Sistem &amp; Pengisian RCA: </w:t>
+        <w:t xml:space="preserve">• 5. Pemulihan Sistem &amp; Pengisian RCA: </w:t>
       </w:r>
       <w:r>
         <w:rPr>
-          <w:sz w:val="19"/>
+          <w:sz w:val="18"/>
         </w:rPr>
         <w:t>Setelah infrastruktur kembali normal, teknisi mengisi formulir penyelesaian yang memuat penyebab gangguan (Root Cause), langkah pemulihan, dan saran preventif. Tiket diubah ke status RESOLVED dan waktu resolusi bersih (Net MTTR) dikunci.</w:t>
       </w:r>
@@ -2340,13 +2468,13 @@
       <w:r>
         <w:rPr>
           <w:b/>
-          <w:sz w:val="19"/>
+          <w:sz w:val="18"/>
         </w:rPr>
-        <w:t xml:space="preserve">• Tahap 6: Verifikasi Klien &amp; Penutupan Tiket (Closed): </w:t>
+        <w:t xml:space="preserve">• 6. Verifikasi Klien &amp; Penutupan Tiket (Closed): </w:t>
       </w:r>
       <w:r>
         <w:rPr>
-          <w:sz w:val="19"/>
+          <w:sz w:val="18"/>
         </w:rPr>
         <w:t>Prosedur perbaikan yang efektif dapat diajukan ke antrean persetujuan Knowledge Base (KCS). Tiket ditutup permanen (CLOSED) setelah adanya konfirmasi dari pelanggan atau melewati masa evaluasi.</w:t>
       </w:r>
@@ -2358,12 +2486,12 @@
     </w:p>
     <w:p>
       <w:pPr>
-        <w:spacing w:before="200" w:after="80"/>
+        <w:spacing w:before="160" w:after="80"/>
       </w:pPr>
       <w:r>
         <w:rPr>
           <w:b/>
-          <w:sz w:val="24"/>
+          <w:sz w:val="23"/>
         </w:rPr>
         <w:t>4. FORMULA &amp; MATRIKS PERHITUNGAN SLA (SERVICE LEVEL AGREEMENT)</w:t>
       </w:r>
@@ -2373,7 +2501,7 @@
         <w:spacing w:after="120"/>
       </w:pPr>
       <w:r>
-        <w:t>Evaluasi kepatuhan tingkat layanan memisahkan dua parameter utama secara independen pada backend Express.js:</w:t>
+        <w:t>Evaluasi performa layanan memisahkan dua parameter utama secara independen pada backend Express.js:</w:t>
       </w:r>
     </w:p>
     <w:tbl>
@@ -2381,28 +2509,36 @@
         <w:tblW w:type="auto" w:w="0"/>
         <w:jc w:val="center"/>
         <w:tblLook w:firstColumn="1" w:firstRow="1" w:lastColumn="0" w:lastRow="0" w:noHBand="0" w:noVBand="1" w:val="04A0"/>
+        <w:tblBorders>
+          <w:top w:val="single" w:sz="4" w:space="0" w:color="CBD5E1"/>
+          <w:bottom w:val="single" w:sz="4" w:space="0" w:color="CBD5E1"/>
+          <w:left w:val="single" w:sz="4" w:space="0" w:color="CBD5E1"/>
+          <w:right w:val="single" w:sz="4" w:space="0" w:color="CBD5E1"/>
+          <w:insideH w:val="single" w:sz="4" w:space="0" w:color="CBD5E1"/>
+          <w:insideV w:val="single" w:sz="4" w:space="0" w:color="CBD5E1"/>
+        </w:tblBorders>
       </w:tblPr>
       <w:tblGrid>
-        <w:gridCol w:w="4514"/>
-        <w:gridCol w:w="4514"/>
+        <w:gridCol w:w="4658"/>
+        <w:gridCol w:w="4658"/>
       </w:tblGrid>
       <w:tr>
         <w:tc>
           <w:tcPr>
-            <w:tcW w:type="dxa" w:w="4514"/>
+            <w:tcW w:type="dxa" w:w="4658"/>
             <w:shd w:fill="F8FAFC"/>
             <w:tcMar>
-              <w:top w:w="100" w:type="dxa"/>
-              <w:bottom w:w="100" w:type="dxa"/>
-              <w:left w:w="150" w:type="dxa"/>
-              <w:right w:w="150" w:type="dxa"/>
+              <w:top w:w="80" w:type="dxa"/>
+              <w:bottom w:w="80" w:type="dxa"/>
+              <w:left w:w="120" w:type="dxa"/>
+              <w:right w:w="120" w:type="dxa"/>
             </w:tcMar>
           </w:tcPr>
           <w:p>
             <w:r>
               <w:rPr>
                 <w:b/>
-                <w:sz w:val="19"/>
+                <w:sz w:val="18"/>
               </w:rPr>
               <w:t>A. Formula Waktu Respon Awal (First Touch SLA)</w:t>
               <w:br/>
@@ -2411,7 +2547,7 @@
               <w:rPr>
                 <w:rFonts w:ascii="Consolas" w:hAnsi="Consolas"/>
                 <w:b/>
-                <w:sz w:val="20"/>
+                <w:sz w:val="19"/>
               </w:rPr>
               <w:t>ΔT_respon = T_respon - T_dibuat</w:t>
               <w:br/>
@@ -2419,7 +2555,7 @@
             <w:r>
               <w:rPr>
                 <w:color w:val="475569"/>
-                <w:sz w:val="17"/>
+                <w:sz w:val="16"/>
               </w:rPr>
               <w:t>Kriteria Terpenuhi: ΔT_respon ≤ Batas Respon Kontrak PKS</w:t>
             </w:r>
@@ -2427,20 +2563,20 @@
         </w:tc>
         <w:tc>
           <w:tcPr>
-            <w:tcW w:type="dxa" w:w="4514"/>
+            <w:tcW w:type="dxa" w:w="4658"/>
             <w:shd w:fill="F8FAFC"/>
             <w:tcMar>
-              <w:top w:w="100" w:type="dxa"/>
-              <w:bottom w:w="100" w:type="dxa"/>
-              <w:left w:w="150" w:type="dxa"/>
-              <w:right w:w="150" w:type="dxa"/>
+              <w:top w:w="80" w:type="dxa"/>
+              <w:bottom w:w="80" w:type="dxa"/>
+              <w:left w:w="120" w:type="dxa"/>
+              <w:right w:w="120" w:type="dxa"/>
             </w:tcMar>
           </w:tcPr>
           <w:p>
             <w:r>
               <w:rPr>
                 <w:b/>
-                <w:sz w:val="19"/>
+                <w:sz w:val="18"/>
               </w:rPr>
               <w:t>B. Formula Waktu Resolusi Bersih (Net MTTR SLA)</w:t>
               <w:br/>
@@ -2449,7 +2585,7 @@
               <w:rPr>
                 <w:rFonts w:ascii="Consolas" w:hAnsi="Consolas"/>
                 <w:b/>
-                <w:sz w:val="20"/>
+                <w:sz w:val="19"/>
               </w:rPr>
               <w:t>Net MTTR = (T_selesai - T_dibuat) - Σ T_pause</w:t>
               <w:br/>
@@ -2457,7 +2593,7 @@
             <w:r>
               <w:rPr>
                 <w:color w:val="475569"/>
-                <w:sz w:val="17"/>
+                <w:sz w:val="16"/>
               </w:rPr>
               <w:t>Kriteria Terpenuhi: Net MTTR ≤ Batas Resolusi Kontrak PKS</w:t>
             </w:r>
@@ -2472,12 +2608,12 @@
     </w:p>
     <w:p>
       <w:pPr>
-        <w:spacing w:before="160" w:after="80"/>
+        <w:spacing w:before="120" w:after="80"/>
       </w:pPr>
       <w:r>
         <w:rPr>
           <w:b/>
-          <w:sz w:val="21"/>
+          <w:sz w:val="20"/>
         </w:rPr>
         <w:t>A. Matriks Standar Kontrak Tingkat Layanan (PKS)</w:t>
       </w:r>
@@ -2487,118 +2623,29 @@
         <w:tblW w:type="auto" w:w="0"/>
         <w:jc w:val="center"/>
         <w:tblLook w:firstColumn="1" w:firstRow="1" w:lastColumn="0" w:lastRow="0" w:noHBand="0" w:noVBand="1" w:val="04A0"/>
+        <w:tblBorders>
+          <w:top w:val="single" w:sz="4" w:space="0" w:color="CBD5E1"/>
+          <w:bottom w:val="single" w:sz="4" w:space="0" w:color="CBD5E1"/>
+          <w:left w:val="single" w:sz="4" w:space="0" w:color="CBD5E1"/>
+          <w:right w:val="single" w:sz="4" w:space="0" w:color="CBD5E1"/>
+          <w:insideH w:val="single" w:sz="4" w:space="0" w:color="CBD5E1"/>
+          <w:insideV w:val="single" w:sz="4" w:space="0" w:color="CBD5E1"/>
+        </w:tblBorders>
       </w:tblPr>
       <w:tblGrid>
-        <w:gridCol w:w="2257"/>
-        <w:gridCol w:w="2257"/>
-        <w:gridCol w:w="2257"/>
-        <w:gridCol w:w="2257"/>
+        <w:gridCol w:w="2329"/>
+        <w:gridCol w:w="2329"/>
+        <w:gridCol w:w="2329"/>
+        <w:gridCol w:w="2329"/>
       </w:tblGrid>
       <w:tr>
         <w:tc>
           <w:tcPr>
-            <w:tcW w:type="dxa" w:w="2257"/>
+            <w:tcW w:type="dxa" w:w="2329"/>
             <w:shd w:fill="F1F5F9"/>
             <w:tcMar>
-              <w:top w:w="100" w:type="dxa"/>
-              <w:bottom w:w="100" w:type="dxa"/>
-              <w:left w:w="120" w:type="dxa"/>
-              <w:right w:w="120" w:type="dxa"/>
-            </w:tcMar>
-          </w:tcPr>
-          <w:p>
-            <w:pPr>
-              <w:jc w:val="left"/>
-            </w:pPr>
-            <w:r>
-              <w:rPr>
-                <w:b/>
-                <w:sz w:val="18"/>
-              </w:rPr>
-              <w:t>Tingkatan Kontrak</w:t>
-            </w:r>
-          </w:p>
-        </w:tc>
-        <w:tc>
-          <w:tcPr>
-            <w:tcW w:type="dxa" w:w="2257"/>
-            <w:shd w:fill="F1F5F9"/>
-            <w:tcMar>
-              <w:top w:w="100" w:type="dxa"/>
-              <w:bottom w:w="100" w:type="dxa"/>
-              <w:left w:w="120" w:type="dxa"/>
-              <w:right w:w="120" w:type="dxa"/>
-            </w:tcMar>
-          </w:tcPr>
-          <w:p>
-            <w:pPr>
-              <w:jc w:val="center"/>
-            </w:pPr>
-            <w:r>
-              <w:rPr>
-                <w:b/>
-                <w:sz w:val="18"/>
-              </w:rPr>
-              <w:t>Jadwal Jam Operasional</w:t>
-            </w:r>
-          </w:p>
-        </w:tc>
-        <w:tc>
-          <w:tcPr>
-            <w:tcW w:type="dxa" w:w="2257"/>
-            <w:shd w:fill="F1F5F9"/>
-            <w:tcMar>
-              <w:top w:w="100" w:type="dxa"/>
-              <w:bottom w:w="100" w:type="dxa"/>
-              <w:left w:w="120" w:type="dxa"/>
-              <w:right w:w="120" w:type="dxa"/>
-            </w:tcMar>
-          </w:tcPr>
-          <w:p>
-            <w:pPr>
-              <w:jc w:val="center"/>
-            </w:pPr>
-            <w:r>
-              <w:rPr>
-                <w:b/>
-                <w:sz w:val="18"/>
-              </w:rPr>
-              <w:t>Target Waktu Respon</w:t>
-            </w:r>
-          </w:p>
-        </w:tc>
-        <w:tc>
-          <w:tcPr>
-            <w:tcW w:type="dxa" w:w="2257"/>
-            <w:shd w:fill="F1F5F9"/>
-            <w:tcMar>
-              <w:top w:w="100" w:type="dxa"/>
-              <w:bottom w:w="100" w:type="dxa"/>
-              <w:left w:w="120" w:type="dxa"/>
-              <w:right w:w="120" w:type="dxa"/>
-            </w:tcMar>
-          </w:tcPr>
-          <w:p>
-            <w:pPr>
-              <w:jc w:val="center"/>
-            </w:pPr>
-            <w:r>
-              <w:rPr>
-                <w:b/>
-                <w:sz w:val="18"/>
-              </w:rPr>
-              <w:t>Target Resolusi Net MTTR</w:t>
-            </w:r>
-          </w:p>
-        </w:tc>
-      </w:tr>
-      <w:tr>
-        <w:tc>
-          <w:tcPr>
-            <w:tcW w:type="dxa" w:w="2257"/>
-            <w:tcMar>
-              <w:top w:w="70" w:type="dxa"/>
-              <w:bottom w:w="70" w:type="dxa"/>
+              <w:top w:w="80" w:type="dxa"/>
+              <w:bottom w:w="80" w:type="dxa"/>
               <w:left w:w="100" w:type="dxa"/>
               <w:right w:w="100" w:type="dxa"/>
             </w:tcMar>
@@ -2607,37 +2654,19 @@
             <w:r>
               <w:rPr>
                 <w:b/>
-                <w:sz w:val="18"/>
+                <w:sz w:val="17"/>
               </w:rPr>
-              <w:t>Platinum 24×7</w:t>
+              <w:t>Tingkatan Kontrak</w:t>
             </w:r>
           </w:p>
         </w:tc>
         <w:tc>
           <w:tcPr>
-            <w:tcW w:type="dxa" w:w="2257"/>
+            <w:tcW w:type="dxa" w:w="2329"/>
+            <w:shd w:fill="F1F5F9"/>
             <w:tcMar>
-              <w:top w:w="70" w:type="dxa"/>
-              <w:bottom w:w="70" w:type="dxa"/>
-              <w:left w:w="100" w:type="dxa"/>
-              <w:right w:w="100" w:type="dxa"/>
-            </w:tcMar>
-          </w:tcPr>
-          <w:p>
-            <w:r>
-              <w:rPr>
-                <w:sz w:val="18"/>
-              </w:rPr>
-              <w:t>24 Jam × 7 Hari (Non-Stop)</w:t>
-            </w:r>
-          </w:p>
-        </w:tc>
-        <w:tc>
-          <w:tcPr>
-            <w:tcW w:type="dxa" w:w="2257"/>
-            <w:tcMar>
-              <w:top w:w="70" w:type="dxa"/>
-              <w:bottom w:w="70" w:type="dxa"/>
+              <w:top w:w="80" w:type="dxa"/>
+              <w:bottom w:w="80" w:type="dxa"/>
               <w:left w:w="100" w:type="dxa"/>
               <w:right w:w="100" w:type="dxa"/>
             </w:tcMar>
@@ -2648,18 +2677,20 @@
             </w:pPr>
             <w:r>
               <w:rPr>
-                <w:sz w:val="18"/>
+                <w:b/>
+                <w:sz w:val="17"/>
               </w:rPr>
-              <w:t>≤ 30 Menit</w:t>
+              <w:t>Jadwal Jam Operasional</w:t>
             </w:r>
           </w:p>
         </w:tc>
         <w:tc>
           <w:tcPr>
-            <w:tcW w:type="dxa" w:w="2257"/>
+            <w:tcW w:type="dxa" w:w="2329"/>
+            <w:shd w:fill="F1F5F9"/>
             <w:tcMar>
-              <w:top w:w="70" w:type="dxa"/>
-              <w:bottom w:w="70" w:type="dxa"/>
+              <w:top w:w="80" w:type="dxa"/>
+              <w:bottom w:w="80" w:type="dxa"/>
               <w:left w:w="100" w:type="dxa"/>
               <w:right w:w="100" w:type="dxa"/>
             </w:tcMar>
@@ -2670,62 +2701,20 @@
             </w:pPr>
             <w:r>
               <w:rPr>
-                <w:sz w:val="18"/>
+                <w:b/>
+                <w:sz w:val="17"/>
               </w:rPr>
-              <w:t>≤ 4 Jam</w:t>
-            </w:r>
-          </w:p>
-        </w:tc>
-      </w:tr>
-      <w:tr>
-        <w:tc>
-          <w:tcPr>
-            <w:tcW w:type="dxa" w:w="2257"/>
-            <w:shd w:fill="F8FAFC"/>
-            <w:tcMar>
-              <w:top w:w="70" w:type="dxa"/>
-              <w:bottom w:w="70" w:type="dxa"/>
-              <w:left w:w="100" w:type="dxa"/>
-              <w:right w:w="100" w:type="dxa"/>
-            </w:tcMar>
-          </w:tcPr>
-          <w:p>
-            <w:r>
-              <w:rPr>
-                <w:b/>
-                <w:sz w:val="18"/>
-              </w:rPr>
-              <w:t>Gold 8×5</w:t>
+              <w:t>Target Waktu Respon</w:t>
             </w:r>
           </w:p>
         </w:tc>
         <w:tc>
           <w:tcPr>
-            <w:tcW w:type="dxa" w:w="2257"/>
-            <w:shd w:fill="F8FAFC"/>
+            <w:tcW w:type="dxa" w:w="2329"/>
+            <w:shd w:fill="F1F5F9"/>
             <w:tcMar>
-              <w:top w:w="70" w:type="dxa"/>
-              <w:bottom w:w="70" w:type="dxa"/>
-              <w:left w:w="100" w:type="dxa"/>
-              <w:right w:w="100" w:type="dxa"/>
-            </w:tcMar>
-          </w:tcPr>
-          <w:p>
-            <w:r>
-              <w:rPr>
-                <w:sz w:val="18"/>
-              </w:rPr>
-              <w:t>Senin – Jumat (08:00 – 17:00 WIB)</w:t>
-            </w:r>
-          </w:p>
-        </w:tc>
-        <w:tc>
-          <w:tcPr>
-            <w:tcW w:type="dxa" w:w="2257"/>
-            <w:shd w:fill="F8FAFC"/>
-            <w:tcMar>
-              <w:top w:w="70" w:type="dxa"/>
-              <w:bottom w:w="70" w:type="dxa"/>
+              <w:top w:w="80" w:type="dxa"/>
+              <w:bottom w:w="80" w:type="dxa"/>
               <w:left w:w="100" w:type="dxa"/>
               <w:right w:w="100" w:type="dxa"/>
             </w:tcMar>
@@ -2736,21 +2725,62 @@
             </w:pPr>
             <w:r>
               <w:rPr>
-                <w:sz w:val="18"/>
+                <w:b/>
+                <w:sz w:val="17"/>
               </w:rPr>
-              <w:t>≤ 30 Menit</w:t>
+              <w:t>Target Resolusi Net MTTR</w:t>
+            </w:r>
+          </w:p>
+        </w:tc>
+      </w:tr>
+      <w:tr>
+        <w:tc>
+          <w:tcPr>
+            <w:tcW w:type="dxa" w:w="2329"/>
+            <w:tcMar>
+              <w:top w:w="55" w:type="dxa"/>
+              <w:bottom w:w="55" w:type="dxa"/>
+              <w:left w:w="90" w:type="dxa"/>
+              <w:right w:w="90" w:type="dxa"/>
+            </w:tcMar>
+          </w:tcPr>
+          <w:p>
+            <w:r>
+              <w:rPr>
+                <w:b/>
+                <w:sz w:val="17"/>
+              </w:rPr>
+              <w:t>Platinum 24×7</w:t>
             </w:r>
           </w:p>
         </w:tc>
         <w:tc>
           <w:tcPr>
-            <w:tcW w:type="dxa" w:w="2257"/>
-            <w:shd w:fill="F8FAFC"/>
+            <w:tcW w:type="dxa" w:w="2329"/>
             <w:tcMar>
-              <w:top w:w="70" w:type="dxa"/>
-              <w:bottom w:w="70" w:type="dxa"/>
-              <w:left w:w="100" w:type="dxa"/>
-              <w:right w:w="100" w:type="dxa"/>
+              <w:top w:w="55" w:type="dxa"/>
+              <w:bottom w:w="55" w:type="dxa"/>
+              <w:left w:w="90" w:type="dxa"/>
+              <w:right w:w="90" w:type="dxa"/>
+            </w:tcMar>
+          </w:tcPr>
+          <w:p>
+            <w:r>
+              <w:rPr>
+                <w:sz w:val="17"/>
+              </w:rPr>
+              <w:t>24 Jam × 7 Hari (Non-Stop)</w:t>
+            </w:r>
+          </w:p>
+        </w:tc>
+        <w:tc>
+          <w:tcPr>
+            <w:tcW w:type="dxa" w:w="2329"/>
+            <w:tcMar>
+              <w:top w:w="55" w:type="dxa"/>
+              <w:bottom w:w="55" w:type="dxa"/>
+              <w:left w:w="90" w:type="dxa"/>
+              <w:right w:w="90" w:type="dxa"/>
             </w:tcMar>
           </w:tcPr>
           <w:p>
@@ -2759,7 +2789,118 @@
             </w:pPr>
             <w:r>
               <w:rPr>
-                <w:sz w:val="18"/>
+                <w:sz w:val="17"/>
+              </w:rPr>
+              <w:t>≤ 30 Menit</w:t>
+            </w:r>
+          </w:p>
+        </w:tc>
+        <w:tc>
+          <w:tcPr>
+            <w:tcW w:type="dxa" w:w="2329"/>
+            <w:tcMar>
+              <w:top w:w="55" w:type="dxa"/>
+              <w:bottom w:w="55" w:type="dxa"/>
+              <w:left w:w="90" w:type="dxa"/>
+              <w:right w:w="90" w:type="dxa"/>
+            </w:tcMar>
+          </w:tcPr>
+          <w:p>
+            <w:pPr>
+              <w:jc w:val="center"/>
+            </w:pPr>
+            <w:r>
+              <w:rPr>
+                <w:sz w:val="17"/>
+              </w:rPr>
+              <w:t>≤ 4 Jam</w:t>
+            </w:r>
+          </w:p>
+        </w:tc>
+      </w:tr>
+      <w:tr>
+        <w:tc>
+          <w:tcPr>
+            <w:tcW w:type="dxa" w:w="2329"/>
+            <w:shd w:fill="F8FAFC"/>
+            <w:tcMar>
+              <w:top w:w="55" w:type="dxa"/>
+              <w:bottom w:w="55" w:type="dxa"/>
+              <w:left w:w="90" w:type="dxa"/>
+              <w:right w:w="90" w:type="dxa"/>
+            </w:tcMar>
+          </w:tcPr>
+          <w:p>
+            <w:r>
+              <w:rPr>
+                <w:b/>
+                <w:sz w:val="17"/>
+              </w:rPr>
+              <w:t>Gold 8×5</w:t>
+            </w:r>
+          </w:p>
+        </w:tc>
+        <w:tc>
+          <w:tcPr>
+            <w:tcW w:type="dxa" w:w="2329"/>
+            <w:shd w:fill="F8FAFC"/>
+            <w:tcMar>
+              <w:top w:w="55" w:type="dxa"/>
+              <w:bottom w:w="55" w:type="dxa"/>
+              <w:left w:w="90" w:type="dxa"/>
+              <w:right w:w="90" w:type="dxa"/>
+            </w:tcMar>
+          </w:tcPr>
+          <w:p>
+            <w:r>
+              <w:rPr>
+                <w:sz w:val="17"/>
+              </w:rPr>
+              <w:t>Senin – Jumat (08:00 – 17:00 WIB)</w:t>
+            </w:r>
+          </w:p>
+        </w:tc>
+        <w:tc>
+          <w:tcPr>
+            <w:tcW w:type="dxa" w:w="2329"/>
+            <w:shd w:fill="F8FAFC"/>
+            <w:tcMar>
+              <w:top w:w="55" w:type="dxa"/>
+              <w:bottom w:w="55" w:type="dxa"/>
+              <w:left w:w="90" w:type="dxa"/>
+              <w:right w:w="90" w:type="dxa"/>
+            </w:tcMar>
+          </w:tcPr>
+          <w:p>
+            <w:pPr>
+              <w:jc w:val="center"/>
+            </w:pPr>
+            <w:r>
+              <w:rPr>
+                <w:sz w:val="17"/>
+              </w:rPr>
+              <w:t>≤ 30 Menit</w:t>
+            </w:r>
+          </w:p>
+        </w:tc>
+        <w:tc>
+          <w:tcPr>
+            <w:tcW w:type="dxa" w:w="2329"/>
+            <w:shd w:fill="F8FAFC"/>
+            <w:tcMar>
+              <w:top w:w="55" w:type="dxa"/>
+              <w:bottom w:w="55" w:type="dxa"/>
+              <w:left w:w="90" w:type="dxa"/>
+              <w:right w:w="90" w:type="dxa"/>
+            </w:tcMar>
+          </w:tcPr>
+          <w:p>
+            <w:pPr>
+              <w:jc w:val="center"/>
+            </w:pPr>
+            <w:r>
+              <w:rPr>
+                <w:sz w:val="17"/>
               </w:rPr>
               <w:t>≤ 8 Jam</w:t>
             </w:r>
@@ -2769,19 +2910,19 @@
       <w:tr>
         <w:tc>
           <w:tcPr>
-            <w:tcW w:type="dxa" w:w="2257"/>
+            <w:tcW w:type="dxa" w:w="2329"/>
             <w:tcMar>
-              <w:top w:w="70" w:type="dxa"/>
-              <w:bottom w:w="70" w:type="dxa"/>
-              <w:left w:w="100" w:type="dxa"/>
-              <w:right w:w="100" w:type="dxa"/>
+              <w:top w:w="55" w:type="dxa"/>
+              <w:bottom w:w="55" w:type="dxa"/>
+              <w:left w:w="90" w:type="dxa"/>
+              <w:right w:w="90" w:type="dxa"/>
             </w:tcMar>
           </w:tcPr>
           <w:p>
             <w:r>
               <w:rPr>
                 <w:b/>
-                <w:sz w:val="18"/>
+                <w:sz w:val="17"/>
               </w:rPr>
               <w:t>Silver 8×5</w:t>
             </w:r>
@@ -2789,18 +2930,18 @@
         </w:tc>
         <w:tc>
           <w:tcPr>
-            <w:tcW w:type="dxa" w:w="2257"/>
+            <w:tcW w:type="dxa" w:w="2329"/>
             <w:tcMar>
-              <w:top w:w="70" w:type="dxa"/>
-              <w:bottom w:w="70" w:type="dxa"/>
-              <w:left w:w="100" w:type="dxa"/>
-              <w:right w:w="100" w:type="dxa"/>
+              <w:top w:w="55" w:type="dxa"/>
+              <w:bottom w:w="55" w:type="dxa"/>
+              <w:left w:w="90" w:type="dxa"/>
+              <w:right w:w="90" w:type="dxa"/>
             </w:tcMar>
           </w:tcPr>
           <w:p>
             <w:r>
               <w:rPr>
-                <w:sz w:val="18"/>
+                <w:sz w:val="17"/>
               </w:rPr>
               <w:t>Senin – Jumat (08:30 – 17:30 WIB)</w:t>
             </w:r>
@@ -2808,12 +2949,12 @@
         </w:tc>
         <w:tc>
           <w:tcPr>
-            <w:tcW w:type="dxa" w:w="2257"/>
+            <w:tcW w:type="dxa" w:w="2329"/>
             <w:tcMar>
-              <w:top w:w="70" w:type="dxa"/>
-              <w:bottom w:w="70" w:type="dxa"/>
-              <w:left w:w="100" w:type="dxa"/>
-              <w:right w:w="100" w:type="dxa"/>
+              <w:top w:w="55" w:type="dxa"/>
+              <w:bottom w:w="55" w:type="dxa"/>
+              <w:left w:w="90" w:type="dxa"/>
+              <w:right w:w="90" w:type="dxa"/>
             </w:tcMar>
           </w:tcPr>
           <w:p>
@@ -2822,7 +2963,7 @@
             </w:pPr>
             <w:r>
               <w:rPr>
-                <w:sz w:val="18"/>
+                <w:sz w:val="17"/>
               </w:rPr>
               <w:t>≤ 1 Jam</w:t>
             </w:r>
@@ -2830,12 +2971,12 @@
         </w:tc>
         <w:tc>
           <w:tcPr>
-            <w:tcW w:type="dxa" w:w="2257"/>
+            <w:tcW w:type="dxa" w:w="2329"/>
             <w:tcMar>
-              <w:top w:w="70" w:type="dxa"/>
-              <w:bottom w:w="70" w:type="dxa"/>
-              <w:left w:w="100" w:type="dxa"/>
-              <w:right w:w="100" w:type="dxa"/>
+              <w:top w:w="55" w:type="dxa"/>
+              <w:bottom w:w="55" w:type="dxa"/>
+              <w:left w:w="90" w:type="dxa"/>
+              <w:right w:w="90" w:type="dxa"/>
             </w:tcMar>
           </w:tcPr>
           <w:p>
@@ -2844,7 +2985,7 @@
             </w:pPr>
             <w:r>
               <w:rPr>
-                <w:sz w:val="18"/>
+                <w:sz w:val="17"/>
               </w:rPr>
               <w:t>≤ 12 Jam</w:t>
             </w:r>
@@ -2854,20 +2995,20 @@
       <w:tr>
         <w:tc>
           <w:tcPr>
-            <w:tcW w:type="dxa" w:w="2257"/>
+            <w:tcW w:type="dxa" w:w="2329"/>
             <w:shd w:fill="F8FAFC"/>
             <w:tcMar>
-              <w:top w:w="70" w:type="dxa"/>
-              <w:bottom w:w="70" w:type="dxa"/>
-              <w:left w:w="100" w:type="dxa"/>
-              <w:right w:w="100" w:type="dxa"/>
+              <w:top w:w="55" w:type="dxa"/>
+              <w:bottom w:w="55" w:type="dxa"/>
+              <w:left w:w="90" w:type="dxa"/>
+              <w:right w:w="90" w:type="dxa"/>
             </w:tcMar>
           </w:tcPr>
           <w:p>
             <w:r>
               <w:rPr>
                 <w:b/>
-                <w:sz w:val="18"/>
+                <w:sz w:val="17"/>
               </w:rPr>
               <w:t>Pemerintah Tier-1</w:t>
             </w:r>
@@ -2875,19 +3016,19 @@
         </w:tc>
         <w:tc>
           <w:tcPr>
-            <w:tcW w:type="dxa" w:w="2257"/>
+            <w:tcW w:type="dxa" w:w="2329"/>
             <w:shd w:fill="F8FAFC"/>
             <w:tcMar>
-              <w:top w:w="70" w:type="dxa"/>
-              <w:bottom w:w="70" w:type="dxa"/>
-              <w:left w:w="100" w:type="dxa"/>
-              <w:right w:w="100" w:type="dxa"/>
+              <w:top w:w="55" w:type="dxa"/>
+              <w:bottom w:w="55" w:type="dxa"/>
+              <w:left w:w="90" w:type="dxa"/>
+              <w:right w:w="90" w:type="dxa"/>
             </w:tcMar>
           </w:tcPr>
           <w:p>
             <w:r>
               <w:rPr>
-                <w:sz w:val="18"/>
+                <w:sz w:val="17"/>
               </w:rPr>
               <w:t>Jam Kantor Dinas Pemerintah (8×5)</w:t>
             </w:r>
@@ -2895,13 +3036,13 @@
         </w:tc>
         <w:tc>
           <w:tcPr>
-            <w:tcW w:type="dxa" w:w="2257"/>
+            <w:tcW w:type="dxa" w:w="2329"/>
             <w:shd w:fill="F8FAFC"/>
             <w:tcMar>
-              <w:top w:w="70" w:type="dxa"/>
-              <w:bottom w:w="70" w:type="dxa"/>
-              <w:left w:w="100" w:type="dxa"/>
-              <w:right w:w="100" w:type="dxa"/>
+              <w:top w:w="55" w:type="dxa"/>
+              <w:bottom w:w="55" w:type="dxa"/>
+              <w:left w:w="90" w:type="dxa"/>
+              <w:right w:w="90" w:type="dxa"/>
             </w:tcMar>
           </w:tcPr>
           <w:p>
@@ -2910,7 +3051,7 @@
             </w:pPr>
             <w:r>
               <w:rPr>
-                <w:sz w:val="18"/>
+                <w:sz w:val="17"/>
               </w:rPr>
               <w:t>≤ 1 Jam</w:t>
             </w:r>
@@ -2918,13 +3059,13 @@
         </w:tc>
         <w:tc>
           <w:tcPr>
-            <w:tcW w:type="dxa" w:w="2257"/>
+            <w:tcW w:type="dxa" w:w="2329"/>
             <w:shd w:fill="F8FAFC"/>
             <w:tcMar>
-              <w:top w:w="70" w:type="dxa"/>
-              <w:bottom w:w="70" w:type="dxa"/>
-              <w:left w:w="100" w:type="dxa"/>
-              <w:right w:w="100" w:type="dxa"/>
+              <w:top w:w="55" w:type="dxa"/>
+              <w:bottom w:w="55" w:type="dxa"/>
+              <w:left w:w="90" w:type="dxa"/>
+              <w:right w:w="90" w:type="dxa"/>
             </w:tcMar>
           </w:tcPr>
           <w:p>
@@ -2933,7 +3074,7 @@
             </w:pPr>
             <w:r>
               <w:rPr>
-                <w:sz w:val="18"/>
+                <w:sz w:val="17"/>
               </w:rPr>
               <w:t>≤ 12 Jam</w:t>
             </w:r>
@@ -2948,12 +3089,12 @@
     </w:p>
     <w:p>
       <w:pPr>
-        <w:spacing w:before="160" w:after="80"/>
+        <w:spacing w:before="120" w:after="80"/>
       </w:pPr>
       <w:r>
         <w:rPr>
           <w:b/>
-          <w:sz w:val="21"/>
+          <w:sz w:val="20"/>
         </w:rPr>
         <w:t>B. Matriks Ambang Batas Pemicu Eskalasi Otomatis (Node-Cron Service)</w:t>
       </w:r>
@@ -2963,30 +3104,38 @@
         <w:tblW w:type="auto" w:w="0"/>
         <w:jc w:val="center"/>
         <w:tblLook w:firstColumn="1" w:firstRow="1" w:lastColumn="0" w:lastRow="0" w:noHBand="0" w:noVBand="1" w:val="04A0"/>
+        <w:tblBorders>
+          <w:top w:val="single" w:sz="4" w:space="0" w:color="CBD5E1"/>
+          <w:bottom w:val="single" w:sz="4" w:space="0" w:color="CBD5E1"/>
+          <w:left w:val="single" w:sz="4" w:space="0" w:color="CBD5E1"/>
+          <w:right w:val="single" w:sz="4" w:space="0" w:color="CBD5E1"/>
+          <w:insideH w:val="single" w:sz="4" w:space="0" w:color="CBD5E1"/>
+          <w:insideV w:val="single" w:sz="4" w:space="0" w:color="CBD5E1"/>
+        </w:tblBorders>
       </w:tblPr>
       <w:tblGrid>
-        <w:gridCol w:w="2257"/>
-        <w:gridCol w:w="2257"/>
-        <w:gridCol w:w="2257"/>
-        <w:gridCol w:w="2257"/>
+        <w:gridCol w:w="2329"/>
+        <w:gridCol w:w="2329"/>
+        <w:gridCol w:w="2329"/>
+        <w:gridCol w:w="2329"/>
       </w:tblGrid>
       <w:tr>
         <w:tc>
           <w:tcPr>
-            <w:tcW w:type="dxa" w:w="2257"/>
+            <w:tcW w:type="dxa" w:w="2329"/>
             <w:shd w:fill="F1F5F9"/>
             <w:tcMar>
-              <w:top w:w="100" w:type="dxa"/>
-              <w:bottom w:w="100" w:type="dxa"/>
-              <w:left w:w="120" w:type="dxa"/>
-              <w:right w:w="120" w:type="dxa"/>
+              <w:top w:w="80" w:type="dxa"/>
+              <w:bottom w:w="80" w:type="dxa"/>
+              <w:left w:w="100" w:type="dxa"/>
+              <w:right w:w="100" w:type="dxa"/>
             </w:tcMar>
           </w:tcPr>
           <w:p>
             <w:r>
               <w:rPr>
                 <w:b/>
-                <w:sz w:val="18"/>
+                <w:sz w:val="17"/>
               </w:rPr>
               <w:t>Tahap Eskalasi</w:t>
             </w:r>
@@ -2994,20 +3143,20 @@
         </w:tc>
         <w:tc>
           <w:tcPr>
-            <w:tcW w:type="dxa" w:w="2257"/>
+            <w:tcW w:type="dxa" w:w="2329"/>
             <w:shd w:fill="F1F5F9"/>
             <w:tcMar>
-              <w:top w:w="100" w:type="dxa"/>
-              <w:bottom w:w="100" w:type="dxa"/>
-              <w:left w:w="120" w:type="dxa"/>
-              <w:right w:w="120" w:type="dxa"/>
+              <w:top w:w="80" w:type="dxa"/>
+              <w:bottom w:w="80" w:type="dxa"/>
+              <w:left w:w="100" w:type="dxa"/>
+              <w:right w:w="100" w:type="dxa"/>
             </w:tcMar>
           </w:tcPr>
           <w:p>
             <w:r>
               <w:rPr>
                 <w:b/>
-                <w:sz w:val="18"/>
+                <w:sz w:val="17"/>
               </w:rPr>
               <w:t>Ambang Batas Waktu</w:t>
             </w:r>
@@ -3015,20 +3164,20 @@
         </w:tc>
         <w:tc>
           <w:tcPr>
-            <w:tcW w:type="dxa" w:w="2257"/>
+            <w:tcW w:type="dxa" w:w="2329"/>
             <w:shd w:fill="F1F5F9"/>
             <w:tcMar>
-              <w:top w:w="100" w:type="dxa"/>
-              <w:bottom w:w="100" w:type="dxa"/>
-              <w:left w:w="120" w:type="dxa"/>
-              <w:right w:w="120" w:type="dxa"/>
+              <w:top w:w="80" w:type="dxa"/>
+              <w:bottom w:w="80" w:type="dxa"/>
+              <w:left w:w="100" w:type="dxa"/>
+              <w:right w:w="100" w:type="dxa"/>
             </w:tcMar>
           </w:tcPr>
           <w:p>
             <w:r>
               <w:rPr>
                 <w:b/>
-                <w:sz w:val="18"/>
+                <w:sz w:val="17"/>
               </w:rPr>
               <w:t>Aksi Sistem Otomatis</w:t>
             </w:r>
@@ -3036,20 +3185,20 @@
         </w:tc>
         <w:tc>
           <w:tcPr>
-            <w:tcW w:type="dxa" w:w="2257"/>
+            <w:tcW w:type="dxa" w:w="2329"/>
             <w:shd w:fill="F1F5F9"/>
             <w:tcMar>
-              <w:top w:w="100" w:type="dxa"/>
-              <w:bottom w:w="100" w:type="dxa"/>
-              <w:left w:w="120" w:type="dxa"/>
-              <w:right w:w="120" w:type="dxa"/>
+              <w:top w:w="80" w:type="dxa"/>
+              <w:bottom w:w="80" w:type="dxa"/>
+              <w:left w:w="100" w:type="dxa"/>
+              <w:right w:w="100" w:type="dxa"/>
             </w:tcMar>
           </w:tcPr>
           <w:p>
             <w:r>
               <w:rPr>
                 <w:b/>
-                <w:sz w:val="18"/>
+                <w:sz w:val="17"/>
               </w:rPr>
               <w:t>Tujuan Notifikasi Surel</w:t>
             </w:r>
@@ -3059,19 +3208,19 @@
       <w:tr>
         <w:tc>
           <w:tcPr>
-            <w:tcW w:type="dxa" w:w="2257"/>
+            <w:tcW w:type="dxa" w:w="2329"/>
             <w:tcMar>
-              <w:top w:w="70" w:type="dxa"/>
-              <w:bottom w:w="70" w:type="dxa"/>
-              <w:left w:w="100" w:type="dxa"/>
-              <w:right w:w="100" w:type="dxa"/>
+              <w:top w:w="55" w:type="dxa"/>
+              <w:bottom w:w="55" w:type="dxa"/>
+              <w:left w:w="90" w:type="dxa"/>
+              <w:right w:w="90" w:type="dxa"/>
             </w:tcMar>
           </w:tcPr>
           <w:p>
             <w:r>
               <w:rPr>
                 <w:b/>
-                <w:sz w:val="18"/>
+                <w:sz w:val="17"/>
               </w:rPr>
               <w:t>1. Peringatan Dini</w:t>
             </w:r>
@@ -3079,18 +3228,18 @@
         </w:tc>
         <w:tc>
           <w:tcPr>
-            <w:tcW w:type="dxa" w:w="2257"/>
+            <w:tcW w:type="dxa" w:w="2329"/>
             <w:tcMar>
-              <w:top w:w="70" w:type="dxa"/>
-              <w:bottom w:w="70" w:type="dxa"/>
-              <w:left w:w="100" w:type="dxa"/>
-              <w:right w:w="100" w:type="dxa"/>
+              <w:top w:w="55" w:type="dxa"/>
+              <w:bottom w:w="55" w:type="dxa"/>
+              <w:left w:w="90" w:type="dxa"/>
+              <w:right w:w="90" w:type="dxa"/>
             </w:tcMar>
           </w:tcPr>
           <w:p>
             <w:r>
               <w:rPr>
-                <w:sz w:val="18"/>
+                <w:sz w:val="17"/>
               </w:rPr>
               <w:t>Durasi Mencapai 50% Target MTTR</w:t>
             </w:r>
@@ -3098,18 +3247,18 @@
         </w:tc>
         <w:tc>
           <w:tcPr>
-            <w:tcW w:type="dxa" w:w="2257"/>
+            <w:tcW w:type="dxa" w:w="2329"/>
             <w:tcMar>
-              <w:top w:w="70" w:type="dxa"/>
-              <w:bottom w:w="70" w:type="dxa"/>
-              <w:left w:w="100" w:type="dxa"/>
-              <w:right w:w="100" w:type="dxa"/>
+              <w:top w:w="55" w:type="dxa"/>
+              <w:bottom w:w="55" w:type="dxa"/>
+              <w:left w:w="90" w:type="dxa"/>
+              <w:right w:w="90" w:type="dxa"/>
             </w:tcMar>
           </w:tcPr>
           <w:p>
             <w:r>
               <w:rPr>
-                <w:sz w:val="18"/>
+                <w:sz w:val="17"/>
               </w:rPr>
               <w:t>Kirim surel pengingat status pengerjaan</w:t>
             </w:r>
@@ -3117,18 +3266,18 @@
         </w:tc>
         <w:tc>
           <w:tcPr>
-            <w:tcW w:type="dxa" w:w="2257"/>
+            <w:tcW w:type="dxa" w:w="2329"/>
             <w:tcMar>
-              <w:top w:w="70" w:type="dxa"/>
-              <w:bottom w:w="70" w:type="dxa"/>
-              <w:left w:w="100" w:type="dxa"/>
-              <w:right w:w="100" w:type="dxa"/>
+              <w:top w:w="55" w:type="dxa"/>
+              <w:bottom w:w="55" w:type="dxa"/>
+              <w:left w:w="90" w:type="dxa"/>
+              <w:right w:w="90" w:type="dxa"/>
             </w:tcMar>
           </w:tcPr>
           <w:p>
             <w:r>
               <w:rPr>
-                <w:sz w:val="18"/>
+                <w:sz w:val="17"/>
               </w:rPr>
               <w:t>Teknisi Penanggung Jawab &amp; Lead CPIG</w:t>
             </w:r>
@@ -3138,20 +3287,20 @@
       <w:tr>
         <w:tc>
           <w:tcPr>
-            <w:tcW w:type="dxa" w:w="2257"/>
+            <w:tcW w:type="dxa" w:w="2329"/>
             <w:shd w:fill="F8FAFC"/>
             <w:tcMar>
-              <w:top w:w="70" w:type="dxa"/>
-              <w:bottom w:w="70" w:type="dxa"/>
-              <w:left w:w="100" w:type="dxa"/>
-              <w:right w:w="100" w:type="dxa"/>
+              <w:top w:w="55" w:type="dxa"/>
+              <w:bottom w:w="55" w:type="dxa"/>
+              <w:left w:w="90" w:type="dxa"/>
+              <w:right w:w="90" w:type="dxa"/>
             </w:tcMar>
           </w:tcPr>
           <w:p>
             <w:r>
               <w:rPr>
                 <w:b/>
-                <w:sz w:val="18"/>
+                <w:sz w:val="17"/>
               </w:rPr>
               <w:t>2. Peringatan Kritis</w:t>
             </w:r>
@@ -3159,19 +3308,19 @@
         </w:tc>
         <w:tc>
           <w:tcPr>
-            <w:tcW w:type="dxa" w:w="2257"/>
+            <w:tcW w:type="dxa" w:w="2329"/>
             <w:shd w:fill="F8FAFC"/>
             <w:tcMar>
-              <w:top w:w="70" w:type="dxa"/>
-              <w:bottom w:w="70" w:type="dxa"/>
-              <w:left w:w="100" w:type="dxa"/>
-              <w:right w:w="100" w:type="dxa"/>
+              <w:top w:w="55" w:type="dxa"/>
+              <w:bottom w:w="55" w:type="dxa"/>
+              <w:left w:w="90" w:type="dxa"/>
+              <w:right w:w="90" w:type="dxa"/>
             </w:tcMar>
           </w:tcPr>
           <w:p>
             <w:r>
               <w:rPr>
-                <w:sz w:val="18"/>
+                <w:sz w:val="17"/>
               </w:rPr>
               <w:t>Durasi Mencapai 80% Target MTTR</w:t>
             </w:r>
@@ -3179,19 +3328,19 @@
         </w:tc>
         <w:tc>
           <w:tcPr>
-            <w:tcW w:type="dxa" w:w="2257"/>
+            <w:tcW w:type="dxa" w:w="2329"/>
             <w:shd w:fill="F8FAFC"/>
             <w:tcMar>
-              <w:top w:w="70" w:type="dxa"/>
-              <w:bottom w:w="70" w:type="dxa"/>
-              <w:left w:w="100" w:type="dxa"/>
-              <w:right w:w="100" w:type="dxa"/>
+              <w:top w:w="55" w:type="dxa"/>
+              <w:bottom w:w="55" w:type="dxa"/>
+              <w:left w:w="90" w:type="dxa"/>
+              <w:right w:w="90" w:type="dxa"/>
             </w:tcMar>
           </w:tcPr>
           <w:p>
             <w:r>
               <w:rPr>
-                <w:sz w:val="18"/>
+                <w:sz w:val="17"/>
               </w:rPr>
               <w:t>Kirim surel alert darurat (High Priority)</w:t>
             </w:r>
@@ -3199,19 +3348,19 @@
         </w:tc>
         <w:tc>
           <w:tcPr>
-            <w:tcW w:type="dxa" w:w="2257"/>
+            <w:tcW w:type="dxa" w:w="2329"/>
             <w:shd w:fill="F8FAFC"/>
             <w:tcMar>
-              <w:top w:w="70" w:type="dxa"/>
-              <w:bottom w:w="70" w:type="dxa"/>
-              <w:left w:w="100" w:type="dxa"/>
-              <w:right w:w="100" w:type="dxa"/>
+              <w:top w:w="55" w:type="dxa"/>
+              <w:bottom w:w="55" w:type="dxa"/>
+              <w:left w:w="90" w:type="dxa"/>
+              <w:right w:w="90" w:type="dxa"/>
             </w:tcMar>
           </w:tcPr>
           <w:p>
             <w:r>
               <w:rPr>
-                <w:sz w:val="18"/>
+                <w:sz w:val="17"/>
               </w:rPr>
               <w:t>Service Delivery Lead / Supervisor</w:t>
             </w:r>
@@ -3221,19 +3370,19 @@
       <w:tr>
         <w:tc>
           <w:tcPr>
-            <w:tcW w:type="dxa" w:w="2257"/>
+            <w:tcW w:type="dxa" w:w="2329"/>
             <w:tcMar>
-              <w:top w:w="70" w:type="dxa"/>
-              <w:bottom w:w="70" w:type="dxa"/>
-              <w:left w:w="100" w:type="dxa"/>
-              <w:right w:w="100" w:type="dxa"/>
+              <w:top w:w="55" w:type="dxa"/>
+              <w:bottom w:w="55" w:type="dxa"/>
+              <w:left w:w="90" w:type="dxa"/>
+              <w:right w:w="90" w:type="dxa"/>
             </w:tcMar>
           </w:tcPr>
           <w:p>
             <w:r>
               <w:rPr>
                 <w:b/>
-                <w:sz w:val="18"/>
+                <w:sz w:val="17"/>
               </w:rPr>
               <w:t>3. Pelanggaran SLA</w:t>
             </w:r>
@@ -3241,18 +3390,18 @@
         </w:tc>
         <w:tc>
           <w:tcPr>
-            <w:tcW w:type="dxa" w:w="2257"/>
+            <w:tcW w:type="dxa" w:w="2329"/>
             <w:tcMar>
-              <w:top w:w="70" w:type="dxa"/>
-              <w:bottom w:w="70" w:type="dxa"/>
-              <w:left w:w="100" w:type="dxa"/>
-              <w:right w:w="100" w:type="dxa"/>
+              <w:top w:w="55" w:type="dxa"/>
+              <w:bottom w:w="55" w:type="dxa"/>
+              <w:left w:w="90" w:type="dxa"/>
+              <w:right w:w="90" w:type="dxa"/>
             </w:tcMar>
           </w:tcPr>
           <w:p>
             <w:r>
               <w:rPr>
-                <w:sz w:val="18"/>
+                <w:sz w:val="17"/>
               </w:rPr>
               <w:t>100% Target MTTR Terlampaui</w:t>
             </w:r>
@@ -3260,18 +3409,18 @@
         </w:tc>
         <w:tc>
           <w:tcPr>
-            <w:tcW w:type="dxa" w:w="2257"/>
+            <w:tcW w:type="dxa" w:w="2329"/>
             <w:tcMar>
-              <w:top w:w="70" w:type="dxa"/>
-              <w:bottom w:w="70" w:type="dxa"/>
-              <w:left w:w="100" w:type="dxa"/>
-              <w:right w:w="100" w:type="dxa"/>
+              <w:top w:w="55" w:type="dxa"/>
+              <w:bottom w:w="55" w:type="dxa"/>
+              <w:left w:w="90" w:type="dxa"/>
+              <w:right w:w="90" w:type="dxa"/>
             </w:tcMar>
           </w:tcPr>
           <w:p>
             <w:r>
               <w:rPr>
-                <w:sz w:val="18"/>
+                <w:sz w:val="17"/>
               </w:rPr>
               <w:t>Ubah status menjadi Breached &amp; catat audit log</w:t>
             </w:r>
@@ -3279,18 +3428,18 @@
         </w:tc>
         <w:tc>
           <w:tcPr>
-            <w:tcW w:type="dxa" w:w="2257"/>
+            <w:tcW w:type="dxa" w:w="2329"/>
             <w:tcMar>
-              <w:top w:w="70" w:type="dxa"/>
-              <w:bottom w:w="70" w:type="dxa"/>
-              <w:left w:w="100" w:type="dxa"/>
-              <w:right w:w="100" w:type="dxa"/>
+              <w:top w:w="55" w:type="dxa"/>
+              <w:bottom w:w="55" w:type="dxa"/>
+              <w:left w:w="90" w:type="dxa"/>
+              <w:right w:w="90" w:type="dxa"/>
             </w:tcMar>
           </w:tcPr>
           <w:p>
             <w:r>
               <w:rPr>
-                <w:sz w:val="18"/>
+                <w:sz w:val="17"/>
               </w:rPr>
               <w:t>Manajemen Operasional Helpdesk</w:t>
             </w:r>
@@ -3305,12 +3454,12 @@
     </w:p>
     <w:p>
       <w:pPr>
-        <w:spacing w:before="160" w:after="80"/>
+        <w:spacing w:before="120" w:after="80"/>
       </w:pPr>
       <w:r>
         <w:rPr>
           <w:b/>
-          <w:sz w:val="21"/>
+          <w:sz w:val="20"/>
         </w:rPr>
         <w:t>C. Rincian Entitas Skema Basis Data (MySQL)</w:t>
       </w:r>
@@ -3320,29 +3469,37 @@
         <w:tblW w:type="auto" w:w="0"/>
         <w:jc w:val="center"/>
         <w:tblLook w:firstColumn="1" w:firstRow="1" w:lastColumn="0" w:lastRow="0" w:noHBand="0" w:noVBand="1" w:val="04A0"/>
+        <w:tblBorders>
+          <w:top w:val="single" w:sz="4" w:space="0" w:color="CBD5E1"/>
+          <w:bottom w:val="single" w:sz="4" w:space="0" w:color="CBD5E1"/>
+          <w:left w:val="single" w:sz="4" w:space="0" w:color="CBD5E1"/>
+          <w:right w:val="single" w:sz="4" w:space="0" w:color="CBD5E1"/>
+          <w:insideH w:val="single" w:sz="4" w:space="0" w:color="CBD5E1"/>
+          <w:insideV w:val="single" w:sz="4" w:space="0" w:color="CBD5E1"/>
+        </w:tblBorders>
       </w:tblPr>
       <w:tblGrid>
-        <w:gridCol w:w="3010"/>
-        <w:gridCol w:w="3010"/>
-        <w:gridCol w:w="3010"/>
+        <w:gridCol w:w="3106"/>
+        <w:gridCol w:w="3106"/>
+        <w:gridCol w:w="3106"/>
       </w:tblGrid>
       <w:tr>
         <w:tc>
           <w:tcPr>
-            <w:tcW w:type="dxa" w:w="3010"/>
+            <w:tcW w:type="dxa" w:w="3106"/>
             <w:shd w:fill="F1F5F9"/>
             <w:tcMar>
-              <w:top w:w="100" w:type="dxa"/>
-              <w:bottom w:w="100" w:type="dxa"/>
-              <w:left w:w="120" w:type="dxa"/>
-              <w:right w:w="120" w:type="dxa"/>
+              <w:top w:w="80" w:type="dxa"/>
+              <w:bottom w:w="80" w:type="dxa"/>
+              <w:left w:w="100" w:type="dxa"/>
+              <w:right w:w="100" w:type="dxa"/>
             </w:tcMar>
           </w:tcPr>
           <w:p>
             <w:r>
               <w:rPr>
                 <w:b/>
-                <w:sz w:val="18"/>
+                <w:sz w:val="17"/>
               </w:rPr>
               <w:t>Tabel Basis Data</w:t>
             </w:r>
@@ -3350,20 +3507,20 @@
         </w:tc>
         <w:tc>
           <w:tcPr>
-            <w:tcW w:type="dxa" w:w="3010"/>
+            <w:tcW w:type="dxa" w:w="3106"/>
             <w:shd w:fill="F1F5F9"/>
             <w:tcMar>
-              <w:top w:w="100" w:type="dxa"/>
-              <w:bottom w:w="100" w:type="dxa"/>
-              <w:left w:w="120" w:type="dxa"/>
-              <w:right w:w="120" w:type="dxa"/>
+              <w:top w:w="80" w:type="dxa"/>
+              <w:bottom w:w="80" w:type="dxa"/>
+              <w:left w:w="100" w:type="dxa"/>
+              <w:right w:w="100" w:type="dxa"/>
             </w:tcMar>
           </w:tcPr>
           <w:p>
             <w:r>
               <w:rPr>
                 <w:b/>
-                <w:sz w:val="18"/>
+                <w:sz w:val="17"/>
               </w:rPr>
               <w:t>Kolom Utama</w:t>
             </w:r>
@@ -3371,20 +3528,20 @@
         </w:tc>
         <w:tc>
           <w:tcPr>
-            <w:tcW w:type="dxa" w:w="3010"/>
+            <w:tcW w:type="dxa" w:w="3106"/>
             <w:shd w:fill="F1F5F9"/>
             <w:tcMar>
-              <w:top w:w="100" w:type="dxa"/>
-              <w:bottom w:w="100" w:type="dxa"/>
-              <w:left w:w="120" w:type="dxa"/>
-              <w:right w:w="120" w:type="dxa"/>
+              <w:top w:w="80" w:type="dxa"/>
+              <w:bottom w:w="80" w:type="dxa"/>
+              <w:left w:w="100" w:type="dxa"/>
+              <w:right w:w="100" w:type="dxa"/>
             </w:tcMar>
           </w:tcPr>
           <w:p>
             <w:r>
               <w:rPr>
                 <w:b/>
-                <w:sz w:val="18"/>
+                <w:sz w:val="17"/>
               </w:rPr>
               <w:t>Fungsi Penyimpanan</w:t>
             </w:r>
@@ -3394,12 +3551,12 @@
       <w:tr>
         <w:tc>
           <w:tcPr>
-            <w:tcW w:type="dxa" w:w="3010"/>
+            <w:tcW w:type="dxa" w:w="3106"/>
             <w:tcMar>
-              <w:top w:w="70" w:type="dxa"/>
-              <w:bottom w:w="70" w:type="dxa"/>
-              <w:left w:w="100" w:type="dxa"/>
-              <w:right w:w="100" w:type="dxa"/>
+              <w:top w:w="55" w:type="dxa"/>
+              <w:bottom w:w="55" w:type="dxa"/>
+              <w:left w:w="90" w:type="dxa"/>
+              <w:right w:w="90" w:type="dxa"/>
             </w:tcMar>
           </w:tcPr>
           <w:p>
@@ -3407,7 +3564,7 @@
               <w:rPr>
                 <w:rFonts w:ascii="Consolas" w:hAnsi="Consolas"/>
                 <w:b/>
-                <w:sz w:val="18"/>
+                <w:sz w:val="17"/>
               </w:rPr>
               <w:t>tickets</w:t>
             </w:r>
@@ -3415,18 +3572,18 @@
         </w:tc>
         <w:tc>
           <w:tcPr>
-            <w:tcW w:type="dxa" w:w="3010"/>
+            <w:tcW w:type="dxa" w:w="3106"/>
             <w:tcMar>
-              <w:top w:w="70" w:type="dxa"/>
-              <w:bottom w:w="70" w:type="dxa"/>
-              <w:left w:w="100" w:type="dxa"/>
-              <w:right w:w="100" w:type="dxa"/>
+              <w:top w:w="55" w:type="dxa"/>
+              <w:bottom w:w="55" w:type="dxa"/>
+              <w:left w:w="90" w:type="dxa"/>
+              <w:right w:w="90" w:type="dxa"/>
             </w:tcMar>
           </w:tcPr>
           <w:p>
             <w:r>
               <w:rPr>
-                <w:sz w:val="18"/>
+                <w:sz w:val="17"/>
               </w:rPr>
               <w:t>id, ticket_number, customer_id, assigned_to, status, priority, sla_policy_id</w:t>
             </w:r>
@@ -3434,18 +3591,18 @@
         </w:tc>
         <w:tc>
           <w:tcPr>
-            <w:tcW w:type="dxa" w:w="3010"/>
+            <w:tcW w:type="dxa" w:w="3106"/>
             <w:tcMar>
-              <w:top w:w="70" w:type="dxa"/>
-              <w:bottom w:w="70" w:type="dxa"/>
-              <w:left w:w="100" w:type="dxa"/>
-              <w:right w:w="100" w:type="dxa"/>
+              <w:top w:w="55" w:type="dxa"/>
+              <w:bottom w:w="55" w:type="dxa"/>
+              <w:left w:w="90" w:type="dxa"/>
+              <w:right w:w="90" w:type="dxa"/>
             </w:tcMar>
           </w:tcPr>
           <w:p>
             <w:r>
               <w:rPr>
-                <w:sz w:val="18"/>
+                <w:sz w:val="17"/>
               </w:rPr>
               <w:t>Menyimpan data tiket insiden dan relasi ke pelanggan serta teknisi penanggung jawab.</w:t>
             </w:r>
@@ -3455,13 +3612,13 @@
       <w:tr>
         <w:tc>
           <w:tcPr>
-            <w:tcW w:type="dxa" w:w="3010"/>
+            <w:tcW w:type="dxa" w:w="3106"/>
             <w:shd w:fill="F8FAFC"/>
             <w:tcMar>
-              <w:top w:w="70" w:type="dxa"/>
-              <w:bottom w:w="70" w:type="dxa"/>
-              <w:left w:w="100" w:type="dxa"/>
-              <w:right w:w="100" w:type="dxa"/>
+              <w:top w:w="55" w:type="dxa"/>
+              <w:bottom w:w="55" w:type="dxa"/>
+              <w:left w:w="90" w:type="dxa"/>
+              <w:right w:w="90" w:type="dxa"/>
             </w:tcMar>
           </w:tcPr>
           <w:p>
@@ -3469,7 +3626,7 @@
               <w:rPr>
                 <w:rFonts w:ascii="Consolas" w:hAnsi="Consolas"/>
                 <w:b/>
-                <w:sz w:val="18"/>
+                <w:sz w:val="17"/>
               </w:rPr>
               <w:t>sla_pause_logs</w:t>
             </w:r>
@@ -3477,19 +3634,19 @@
         </w:tc>
         <w:tc>
           <w:tcPr>
-            <w:tcW w:type="dxa" w:w="3010"/>
+            <w:tcW w:type="dxa" w:w="3106"/>
             <w:shd w:fill="F8FAFC"/>
             <w:tcMar>
-              <w:top w:w="70" w:type="dxa"/>
-              <w:bottom w:w="70" w:type="dxa"/>
-              <w:left w:w="100" w:type="dxa"/>
-              <w:right w:w="100" w:type="dxa"/>
+              <w:top w:w="55" w:type="dxa"/>
+              <w:bottom w:w="55" w:type="dxa"/>
+              <w:left w:w="90" w:type="dxa"/>
+              <w:right w:w="90" w:type="dxa"/>
             </w:tcMar>
           </w:tcPr>
           <w:p>
             <w:r>
               <w:rPr>
-                <w:sz w:val="18"/>
+                <w:sz w:val="17"/>
               </w:rPr>
               <w:t>id, ticket_id, reason_type, vendor_case_id, paused_at, resumed_at, total_seconds</w:t>
             </w:r>
@@ -3497,19 +3654,19 @@
         </w:tc>
         <w:tc>
           <w:tcPr>
-            <w:tcW w:type="dxa" w:w="3010"/>
+            <w:tcW w:type="dxa" w:w="3106"/>
             <w:shd w:fill="F8FAFC"/>
             <w:tcMar>
-              <w:top w:w="70" w:type="dxa"/>
-              <w:bottom w:w="70" w:type="dxa"/>
-              <w:left w:w="100" w:type="dxa"/>
-              <w:right w:w="100" w:type="dxa"/>
+              <w:top w:w="55" w:type="dxa"/>
+              <w:bottom w:w="55" w:type="dxa"/>
+              <w:left w:w="90" w:type="dxa"/>
+              <w:right w:w="90" w:type="dxa"/>
             </w:tcMar>
           </w:tcPr>
           <w:p>
             <w:r>
               <w:rPr>
-                <w:sz w:val="18"/>
+                <w:sz w:val="17"/>
               </w:rPr>
               <w:t>Mencatat histori jeda waktu resmi (menunggu suku cadang vendor atau izin jadwal klien).</w:t>
             </w:r>
@@ -3519,12 +3676,12 @@
       <w:tr>
         <w:tc>
           <w:tcPr>
-            <w:tcW w:type="dxa" w:w="3010"/>
+            <w:tcW w:type="dxa" w:w="3106"/>
             <w:tcMar>
-              <w:top w:w="70" w:type="dxa"/>
-              <w:bottom w:w="70" w:type="dxa"/>
-              <w:left w:w="100" w:type="dxa"/>
-              <w:right w:w="100" w:type="dxa"/>
+              <w:top w:w="55" w:type="dxa"/>
+              <w:bottom w:w="55" w:type="dxa"/>
+              <w:left w:w="90" w:type="dxa"/>
+              <w:right w:w="90" w:type="dxa"/>
             </w:tcMar>
           </w:tcPr>
           <w:p>
@@ -3532,7 +3689,7 @@
               <w:rPr>
                 <w:rFonts w:ascii="Consolas" w:hAnsi="Consolas"/>
                 <w:b/>
-                <w:sz w:val="18"/>
+                <w:sz w:val="17"/>
               </w:rPr>
               <w:t>ticket_milestones</w:t>
             </w:r>
@@ -3540,18 +3697,18 @@
         </w:tc>
         <w:tc>
           <w:tcPr>
-            <w:tcW w:type="dxa" w:w="3010"/>
+            <w:tcW w:type="dxa" w:w="3106"/>
             <w:tcMar>
-              <w:top w:w="70" w:type="dxa"/>
-              <w:bottom w:w="70" w:type="dxa"/>
-              <w:left w:w="100" w:type="dxa"/>
-              <w:right w:w="100" w:type="dxa"/>
+              <w:top w:w="55" w:type="dxa"/>
+              <w:bottom w:w="55" w:type="dxa"/>
+              <w:left w:w="90" w:type="dxa"/>
+              <w:right w:w="90" w:type="dxa"/>
             </w:tcMar>
           </w:tcPr>
           <w:p>
             <w:r>
               <w:rPr>
-                <w:sz w:val="18"/>
+                <w:sz w:val="17"/>
               </w:rPr>
               <w:t>id, ticket_id, title, description, command_executed, created_by, created_at</w:t>
             </w:r>
@@ -3559,18 +3716,18 @@
         </w:tc>
         <w:tc>
           <w:tcPr>
-            <w:tcW w:type="dxa" w:w="3010"/>
+            <w:tcW w:type="dxa" w:w="3106"/>
             <w:tcMar>
-              <w:top w:w="70" w:type="dxa"/>
-              <w:bottom w:w="70" w:type="dxa"/>
-              <w:left w:w="100" w:type="dxa"/>
-              <w:right w:w="100" w:type="dxa"/>
+              <w:top w:w="55" w:type="dxa"/>
+              <w:bottom w:w="55" w:type="dxa"/>
+              <w:left w:w="90" w:type="dxa"/>
+              <w:right w:w="90" w:type="dxa"/>
             </w:tcMar>
           </w:tcPr>
           <w:p>
             <w:r>
               <w:rPr>
-                <w:sz w:val="18"/>
+                <w:sz w:val="17"/>
               </w:rPr>
               <w:t>Rekam jejak kronologis langkah diagnosa teknis dan eksekusi perintah terminal oleh teknisi.</w:t>
             </w:r>
@@ -3580,13 +3737,13 @@
       <w:tr>
         <w:tc>
           <w:tcPr>
-            <w:tcW w:type="dxa" w:w="3010"/>
+            <w:tcW w:type="dxa" w:w="3106"/>
             <w:shd w:fill="F8FAFC"/>
             <w:tcMar>
-              <w:top w:w="70" w:type="dxa"/>
-              <w:bottom w:w="70" w:type="dxa"/>
-              <w:left w:w="100" w:type="dxa"/>
-              <w:right w:w="100" w:type="dxa"/>
+              <w:top w:w="55" w:type="dxa"/>
+              <w:bottom w:w="55" w:type="dxa"/>
+              <w:left w:w="90" w:type="dxa"/>
+              <w:right w:w="90" w:type="dxa"/>
             </w:tcMar>
           </w:tcPr>
           <w:p>
@@ -3594,7 +3751,7 @@
               <w:rPr>
                 <w:rFonts w:ascii="Consolas" w:hAnsi="Consolas"/>
                 <w:b/>
-                <w:sz w:val="18"/>
+                <w:sz w:val="17"/>
               </w:rPr>
               <w:t>knowledge_base</w:t>
             </w:r>
@@ -3602,19 +3759,19 @@
         </w:tc>
         <w:tc>
           <w:tcPr>
-            <w:tcW w:type="dxa" w:w="3010"/>
+            <w:tcW w:type="dxa" w:w="3106"/>
             <w:shd w:fill="F8FAFC"/>
             <w:tcMar>
-              <w:top w:w="70" w:type="dxa"/>
-              <w:bottom w:w="70" w:type="dxa"/>
-              <w:left w:w="100" w:type="dxa"/>
-              <w:right w:w="100" w:type="dxa"/>
+              <w:top w:w="55" w:type="dxa"/>
+              <w:bottom w:w="55" w:type="dxa"/>
+              <w:left w:w="90" w:type="dxa"/>
+              <w:right w:w="90" w:type="dxa"/>
             </w:tcMar>
           </w:tcPr>
           <w:p>
             <w:r>
               <w:rPr>
-                <w:sz w:val="18"/>
+                <w:sz w:val="17"/>
               </w:rPr>
               <w:t>id, kb_number, title, category, target_vendor, runbook_steps, status, approved_by</w:t>
             </w:r>
@@ -3622,19 +3779,19 @@
         </w:tc>
         <w:tc>
           <w:tcPr>
-            <w:tcW w:type="dxa" w:w="3010"/>
+            <w:tcW w:type="dxa" w:w="3106"/>
             <w:shd w:fill="F8FAFC"/>
             <w:tcMar>
-              <w:top w:w="70" w:type="dxa"/>
-              <w:bottom w:w="70" w:type="dxa"/>
-              <w:left w:w="100" w:type="dxa"/>
-              <w:right w:w="100" w:type="dxa"/>
+              <w:top w:w="55" w:type="dxa"/>
+              <w:bottom w:w="55" w:type="dxa"/>
+              <w:left w:w="90" w:type="dxa"/>
+              <w:right w:w="90" w:type="dxa"/>
             </w:tcMar>
           </w:tcPr>
           <w:p>
             <w:r>
               <w:rPr>
-                <w:sz w:val="18"/>
+                <w:sz w:val="17"/>
               </w:rPr>
               <w:t>Katalog dokumen SOP terverifikasi yang dihasilkan dari daur ulang solusi insiden nyata.</w:t>
             </w:r>
@@ -3644,12 +3801,12 @@
       <w:tr>
         <w:tc>
           <w:tcPr>
-            <w:tcW w:type="dxa" w:w="3010"/>
+            <w:tcW w:type="dxa" w:w="3106"/>
             <w:tcMar>
-              <w:top w:w="70" w:type="dxa"/>
-              <w:bottom w:w="70" w:type="dxa"/>
-              <w:left w:w="100" w:type="dxa"/>
-              <w:right w:w="100" w:type="dxa"/>
+              <w:top w:w="55" w:type="dxa"/>
+              <w:bottom w:w="55" w:type="dxa"/>
+              <w:left w:w="90" w:type="dxa"/>
+              <w:right w:w="90" w:type="dxa"/>
             </w:tcMar>
           </w:tcPr>
           <w:p>
@@ -3657,7 +3814,7 @@
               <w:rPr>
                 <w:rFonts w:ascii="Consolas" w:hAnsi="Consolas"/>
                 <w:b/>
-                <w:sz w:val="18"/>
+                <w:sz w:val="17"/>
               </w:rPr>
               <w:t>audit_event_logs</w:t>
             </w:r>
@@ -3665,18 +3822,18 @@
         </w:tc>
         <w:tc>
           <w:tcPr>
-            <w:tcW w:type="dxa" w:w="3010"/>
+            <w:tcW w:type="dxa" w:w="3106"/>
             <w:tcMar>
-              <w:top w:w="70" w:type="dxa"/>
-              <w:bottom w:w="70" w:type="dxa"/>
-              <w:left w:w="100" w:type="dxa"/>
-              <w:right w:w="100" w:type="dxa"/>
+              <w:top w:w="55" w:type="dxa"/>
+              <w:bottom w:w="55" w:type="dxa"/>
+              <w:left w:w="90" w:type="dxa"/>
+              <w:right w:w="90" w:type="dxa"/>
             </w:tcMar>
           </w:tcPr>
           <w:p>
             <w:r>
               <w:rPr>
-                <w:sz w:val="18"/>
+                <w:sz w:val="17"/>
               </w:rPr>
               <w:t>id, ticket_id, user_id, action_type, old_value, new_value, timestamp</w:t>
             </w:r>
@@ -3684,18 +3841,18 @@
         </w:tc>
         <w:tc>
           <w:tcPr>
-            <w:tcW w:type="dxa" w:w="3010"/>
+            <w:tcW w:type="dxa" w:w="3106"/>
             <w:tcMar>
-              <w:top w:w="70" w:type="dxa"/>
-              <w:bottom w:w="70" w:type="dxa"/>
-              <w:left w:w="100" w:type="dxa"/>
-              <w:right w:w="100" w:type="dxa"/>
+              <w:top w:w="55" w:type="dxa"/>
+              <w:bottom w:w="55" w:type="dxa"/>
+              <w:left w:w="90" w:type="dxa"/>
+              <w:right w:w="90" w:type="dxa"/>
             </w:tcMar>
           </w:tcPr>
           <w:p>
             <w:r>
               <w:rPr>
-                <w:sz w:val="18"/>
+                <w:sz w:val="17"/>
               </w:rPr>
               <w:t>Catatan jejak audit permanen untuk menjamin integritas data dan riwayat penanganan.</w:t>
             </w:r>
@@ -3705,7 +3862,7 @@
     </w:tbl>
     <w:sectPr>
       <w:pgSz w:w="11909" w:h="16834"/>
-      <w:pgMar w:top="1440" w:right="1440" w:bottom="1440" w:left="1440" w:header="720" w:footer="720" w:gutter="0"/>
+      <w:pgMar w:top="1296" w:right="1296" w:bottom="1296" w:left="1296" w:header="720" w:footer="720" w:gutter="0"/>
       <w:cols w:space="720"/>
       <w:docGrid w:linePitch="360"/>
     </w:sectPr>

</xml_diff>